<commit_message>
Đổi toàn bộ bộ tài liệu sang phong cách tối giản: mực than, ngà, đồng nhũ
Co-Authored-By: Claude Opus 5.5 <noreply@anthropic.com>
Claude-Session: https://claude.ai/code/session_016W4H5FXW9gSiS33Aau8aSB
</commit_message>
<xml_diff>
--- a/04-Huong-dan-truoc-khi-dung/Huong-dan-truoc-khi-su-dung.docx
+++ b/04-Huong-dan-truoc-khi-dung/Huong-dan-truoc-khi-su-dung.docx
@@ -9,14 +9,12 @@
       <w:r>
         <w:rPr>
           <w:rFonts w:ascii="Arial" w:cs="Arial" w:eastAsia="Arial" w:hAnsi="Arial"/>
-          <w:b/>
-          <w:bCs/>
-          <w:color w:val="1F4E47"/>
-          <w:sz w:val="24"/>
-          <w:szCs w:val="24"/>
-          <w:shd w:fill="F2B134" w:color="auto" w:val="clear"/>
-        </w:rPr>
-        <w:t xml:space="preserve"> BỘ TÀI LIỆU DẠY CÙNG AI </w:t>
+          <w:color w:val="A67C3D"/>
+          <w:spacing w:val="80"/>
+          <w:sz w:val="20"/>
+          <w:szCs w:val="20"/>
+        </w:rPr>
+        <w:t xml:space="preserve">BỘ TÀI LIỆU DẠY CÙNG AI</w:t>
       </w:r>
     </w:p>
     <w:p>
@@ -25,12 +23,10 @@
       </w:pPr>
       <w:r>
         <w:rPr>
-          <w:rFonts w:ascii="Arial" w:cs="Arial" w:eastAsia="Arial" w:hAnsi="Arial"/>
-          <w:b/>
-          <w:bCs/>
-          <w:color w:val="1F4E47"/>
-          <w:sz w:val="64"/>
-          <w:szCs w:val="64"/>
+          <w:rFonts w:ascii="Cambria" w:cs="Cambria" w:eastAsia="Cambria" w:hAnsi="Cambria"/>
+          <w:color w:val="1B1F24"/>
+          <w:sz w:val="60"/>
+          <w:szCs w:val="60"/>
         </w:rPr>
         <w:t xml:space="preserve">HƯỚNG DẪN TRƯỚC KHI SỬ DỤNG</w:t>
       </w:r>
@@ -42,7 +38,7 @@
       <w:r>
         <w:rPr>
           <w:rFonts w:ascii="Arial" w:cs="Arial" w:eastAsia="Arial" w:hAnsi="Arial"/>
-          <w:color w:val="1F4E47"/>
+          <w:color w:val="1B1F24"/>
           <w:sz w:val="30"/>
           <w:szCs w:val="30"/>
         </w:rPr>
@@ -104,7 +100,7 @@
           <w:rFonts w:ascii="Arial" w:cs="Arial" w:eastAsia="Arial" w:hAnsi="Arial"/>
           <w:b/>
           <w:bCs/>
-          <w:color w:val="1F4E47"/>
+          <w:color w:val="1B1F24"/>
           <w:sz w:val="24"/>
           <w:szCs w:val="24"/>
         </w:rPr>
@@ -123,14 +119,12 @@
       <w:r>
         <w:rPr>
           <w:rFonts w:ascii="Arial" w:cs="Arial" w:eastAsia="Arial" w:hAnsi="Arial"/>
-          <w:b/>
-          <w:bCs/>
-          <w:color w:val="1F4E47"/>
-          <w:sz w:val="22"/>
-          <w:szCs w:val="22"/>
-          <w:shd w:fill="F2B134" w:color="auto" w:val="clear"/>
-        </w:rPr>
-        <w:t xml:space="preserve"> MỤC 1 </w:t>
+          <w:color w:val="A67C3D"/>
+          <w:spacing w:val="60"/>
+          <w:sz w:val="18"/>
+          <w:szCs w:val="18"/>
+        </w:rPr>
+        <w:t xml:space="preserve">MỤC 1</w:t>
       </w:r>
     </w:p>
     <w:p>
@@ -140,12 +134,10 @@
       </w:pPr>
       <w:r>
         <w:rPr>
-          <w:rFonts w:ascii="Arial" w:cs="Arial" w:eastAsia="Arial" w:hAnsi="Arial"/>
-          <w:b/>
-          <w:bCs/>
-          <w:color w:val="1F4E47"/>
-          <w:sz w:val="44"/>
-          <w:szCs w:val="44"/>
+          <w:rFonts w:ascii="Cambria" w:cs="Cambria" w:eastAsia="Cambria" w:hAnsi="Cambria"/>
+          <w:color w:val="1B1F24"/>
+          <w:sz w:val="48"/>
+          <w:szCs w:val="48"/>
         </w:rPr>
         <w:t xml:space="preserve">Bộ tài liệu gồm những gì</w:t>
       </w:r>
@@ -159,7 +151,7 @@
           <w:rFonts w:ascii="Arial" w:cs="Arial" w:eastAsia="Arial" w:hAnsi="Arial"/>
           <w:i/>
           <w:iCs/>
-          <w:color w:val="1F4E47"/>
+          <w:color w:val="1B1F24"/>
           <w:sz w:val="22"/>
           <w:szCs w:val="22"/>
         </w:rPr>
@@ -195,7 +187,7 @@
               <w:bottom w:val="none" w:color="FFFFFF" w:sz="0"/>
               <w:right w:val="none" w:color="FFFFFF" w:sz="0"/>
             </w:tcBorders>
-            <w:shd w:fill="1F4E47" w:color="auto" w:val="clear"/>
+            <w:shd w:fill="1B1F24" w:color="auto" w:val="clear"/>
             <w:tcMar>
               <w:top w:type="dxa" w:w="90"/>
               <w:left w:type="dxa" w:w="160"/>
@@ -226,7 +218,7 @@
               <w:bottom w:val="none" w:color="FFFFFF" w:sz="0"/>
               <w:right w:val="none" w:color="FFFFFF" w:sz="0"/>
             </w:tcBorders>
-            <w:shd w:fill="1F4E47" w:color="auto" w:val="clear"/>
+            <w:shd w:fill="1B1F24" w:color="auto" w:val="clear"/>
             <w:tcMar>
               <w:top w:type="dxa" w:w="90"/>
               <w:left w:type="dxa" w:w="160"/>
@@ -259,7 +251,7 @@
               <w:bottom w:val="none" w:color="FFFFFF" w:sz="0"/>
               <w:right w:val="none" w:color="FFFFFF" w:sz="0"/>
             </w:tcBorders>
-            <w:shd w:fill="E9EFEE" w:color="auto" w:val="clear"/>
+            <w:shd w:fill="F7F5F0" w:color="auto" w:val="clear"/>
             <w:tcMar>
               <w:top w:type="dxa" w:w="90"/>
               <w:left w:type="dxa" w:w="160"/>
@@ -273,7 +265,7 @@
                 <w:rFonts w:ascii="Arial" w:cs="Arial" w:eastAsia="Arial" w:hAnsi="Arial"/>
                 <w:b/>
                 <w:bCs/>
-                <w:color w:val="1F4E47"/>
+                <w:color w:val="1B1F24"/>
                 <w:sz w:val="20"/>
                 <w:szCs w:val="20"/>
               </w:rPr>
@@ -290,7 +282,7 @@
               <w:bottom w:val="none" w:color="FFFFFF" w:sz="0"/>
               <w:right w:val="none" w:color="FFFFFF" w:sz="0"/>
             </w:tcBorders>
-            <w:shd w:fill="E9EFEE" w:color="auto" w:val="clear"/>
+            <w:shd w:fill="F7F5F0" w:color="auto" w:val="clear"/>
             <w:tcMar>
               <w:top w:type="dxa" w:w="90"/>
               <w:left w:type="dxa" w:w="160"/>
@@ -304,7 +296,7 @@
                 <w:rFonts w:ascii="Arial" w:cs="Arial" w:eastAsia="Arial" w:hAnsi="Arial"/>
                 <w:b w:val="false"/>
                 <w:bCs w:val="false"/>
-                <w:color w:val="1F4E47"/>
+                <w:color w:val="1B1F24"/>
                 <w:sz w:val="20"/>
                 <w:szCs w:val="20"/>
               </w:rPr>
@@ -337,7 +329,7 @@
                 <w:rFonts w:ascii="Arial" w:cs="Arial" w:eastAsia="Arial" w:hAnsi="Arial"/>
                 <w:b/>
                 <w:bCs/>
-                <w:color w:val="1F4E47"/>
+                <w:color w:val="1B1F24"/>
                 <w:sz w:val="20"/>
                 <w:szCs w:val="20"/>
               </w:rPr>
@@ -368,7 +360,7 @@
                 <w:rFonts w:ascii="Arial" w:cs="Arial" w:eastAsia="Arial" w:hAnsi="Arial"/>
                 <w:b w:val="false"/>
                 <w:bCs w:val="false"/>
-                <w:color w:val="1F4E47"/>
+                <w:color w:val="1B1F24"/>
                 <w:sz w:val="20"/>
                 <w:szCs w:val="20"/>
               </w:rPr>
@@ -387,7 +379,7 @@
               <w:bottom w:val="none" w:color="FFFFFF" w:sz="0"/>
               <w:right w:val="none" w:color="FFFFFF" w:sz="0"/>
             </w:tcBorders>
-            <w:shd w:fill="E9EFEE" w:color="auto" w:val="clear"/>
+            <w:shd w:fill="F7F5F0" w:color="auto" w:val="clear"/>
             <w:tcMar>
               <w:top w:type="dxa" w:w="90"/>
               <w:left w:type="dxa" w:w="160"/>
@@ -401,7 +393,7 @@
                 <w:rFonts w:ascii="Arial" w:cs="Arial" w:eastAsia="Arial" w:hAnsi="Arial"/>
                 <w:b/>
                 <w:bCs/>
-                <w:color w:val="1F4E47"/>
+                <w:color w:val="1B1F24"/>
                 <w:sz w:val="20"/>
                 <w:szCs w:val="20"/>
               </w:rPr>
@@ -418,7 +410,7 @@
               <w:bottom w:val="none" w:color="FFFFFF" w:sz="0"/>
               <w:right w:val="none" w:color="FFFFFF" w:sz="0"/>
             </w:tcBorders>
-            <w:shd w:fill="E9EFEE" w:color="auto" w:val="clear"/>
+            <w:shd w:fill="F7F5F0" w:color="auto" w:val="clear"/>
             <w:tcMar>
               <w:top w:type="dxa" w:w="90"/>
               <w:left w:type="dxa" w:w="160"/>
@@ -432,7 +424,7 @@
                 <w:rFonts w:ascii="Arial" w:cs="Arial" w:eastAsia="Arial" w:hAnsi="Arial"/>
                 <w:b w:val="false"/>
                 <w:bCs w:val="false"/>
-                <w:color w:val="1F4E47"/>
+                <w:color w:val="1B1F24"/>
                 <w:sz w:val="20"/>
                 <w:szCs w:val="20"/>
               </w:rPr>
@@ -465,7 +457,7 @@
                 <w:rFonts w:ascii="Arial" w:cs="Arial" w:eastAsia="Arial" w:hAnsi="Arial"/>
                 <w:b/>
                 <w:bCs/>
-                <w:color w:val="1F4E47"/>
+                <w:color w:val="1B1F24"/>
                 <w:sz w:val="20"/>
                 <w:szCs w:val="20"/>
               </w:rPr>
@@ -496,7 +488,7 @@
                 <w:rFonts w:ascii="Arial" w:cs="Arial" w:eastAsia="Arial" w:hAnsi="Arial"/>
                 <w:b w:val="false"/>
                 <w:bCs w:val="false"/>
-                <w:color w:val="1F4E47"/>
+                <w:color w:val="1B1F24"/>
                 <w:sz w:val="20"/>
                 <w:szCs w:val="20"/>
               </w:rPr>
@@ -515,7 +507,7 @@
               <w:bottom w:val="none" w:color="FFFFFF" w:sz="0"/>
               <w:right w:val="none" w:color="FFFFFF" w:sz="0"/>
             </w:tcBorders>
-            <w:shd w:fill="E9EFEE" w:color="auto" w:val="clear"/>
+            <w:shd w:fill="F7F5F0" w:color="auto" w:val="clear"/>
             <w:tcMar>
               <w:top w:type="dxa" w:w="90"/>
               <w:left w:type="dxa" w:w="160"/>
@@ -529,7 +521,7 @@
                 <w:rFonts w:ascii="Arial" w:cs="Arial" w:eastAsia="Arial" w:hAnsi="Arial"/>
                 <w:b/>
                 <w:bCs/>
-                <w:color w:val="1F4E47"/>
+                <w:color w:val="1B1F24"/>
                 <w:sz w:val="20"/>
                 <w:szCs w:val="20"/>
               </w:rPr>
@@ -546,7 +538,7 @@
               <w:bottom w:val="none" w:color="FFFFFF" w:sz="0"/>
               <w:right w:val="none" w:color="FFFFFF" w:sz="0"/>
             </w:tcBorders>
-            <w:shd w:fill="E9EFEE" w:color="auto" w:val="clear"/>
+            <w:shd w:fill="F7F5F0" w:color="auto" w:val="clear"/>
             <w:tcMar>
               <w:top w:type="dxa" w:w="90"/>
               <w:left w:type="dxa" w:w="160"/>
@@ -560,7 +552,7 @@
                 <w:rFonts w:ascii="Arial" w:cs="Arial" w:eastAsia="Arial" w:hAnsi="Arial"/>
                 <w:b w:val="false"/>
                 <w:bCs w:val="false"/>
-                <w:color w:val="1F4E47"/>
+                <w:color w:val="1B1F24"/>
                 <w:sz w:val="20"/>
                 <w:szCs w:val="20"/>
               </w:rPr>
@@ -584,7 +576,7 @@
           <w:rFonts w:ascii="Arial" w:cs="Arial" w:eastAsia="Arial" w:hAnsi="Arial"/>
           <w:b/>
           <w:bCs/>
-          <w:color w:val="1F4E47"/>
+          <w:color w:val="1B1F24"/>
           <w:sz w:val="22"/>
           <w:szCs w:val="22"/>
         </w:rPr>
@@ -593,7 +585,7 @@
       <w:r>
         <w:rPr>
           <w:rFonts w:ascii="Arial" w:cs="Arial" w:eastAsia="Arial" w:hAnsi="Arial"/>
-          <w:color w:val="1F4E47"/>
+          <w:color w:val="1B1F24"/>
           <w:sz w:val="22"/>
           <w:szCs w:val="22"/>
         </w:rPr>
@@ -607,14 +599,12 @@
       <w:r>
         <w:rPr>
           <w:rFonts w:ascii="Arial" w:cs="Arial" w:eastAsia="Arial" w:hAnsi="Arial"/>
-          <w:b/>
-          <w:bCs/>
-          <w:color w:val="1F4E47"/>
-          <w:sz w:val="22"/>
-          <w:szCs w:val="22"/>
-          <w:shd w:fill="F2B134" w:color="auto" w:val="clear"/>
-        </w:rPr>
-        <w:t xml:space="preserve"> MỤC 2 </w:t>
+          <w:color w:val="A67C3D"/>
+          <w:spacing w:val="60"/>
+          <w:sz w:val="18"/>
+          <w:szCs w:val="18"/>
+        </w:rPr>
+        <w:t xml:space="preserve">MỤC 2</w:t>
       </w:r>
     </w:p>
     <w:p>
@@ -624,12 +614,10 @@
       </w:pPr>
       <w:r>
         <w:rPr>
-          <w:rFonts w:ascii="Arial" w:cs="Arial" w:eastAsia="Arial" w:hAnsi="Arial"/>
-          <w:b/>
-          <w:bCs/>
-          <w:color w:val="1F4E47"/>
-          <w:sz w:val="44"/>
-          <w:szCs w:val="44"/>
+          <w:rFonts w:ascii="Cambria" w:cs="Cambria" w:eastAsia="Cambria" w:hAnsi="Cambria"/>
+          <w:color w:val="1B1F24"/>
+          <w:sz w:val="48"/>
+          <w:szCs w:val="48"/>
         </w:rPr>
         <w:t xml:space="preserve">Chuẩn bị thiết bị và tài khoản</w:t>
       </w:r>
@@ -643,7 +631,7 @@
           <w:rFonts w:ascii="Arial" w:cs="Arial" w:eastAsia="Arial" w:hAnsi="Arial"/>
           <w:i/>
           <w:iCs/>
-          <w:color w:val="1F4E47"/>
+          <w:color w:val="1B1F24"/>
           <w:sz w:val="22"/>
           <w:szCs w:val="22"/>
         </w:rPr>
@@ -658,26 +646,23 @@
       </w:pPr>
       <w:r>
         <w:rPr>
-          <w:rFonts w:ascii="Arial" w:cs="Arial" w:eastAsia="Arial" w:hAnsi="Arial"/>
-          <w:b/>
-          <w:bCs/>
-          <w:color w:val="F2B134"/>
-          <w:sz w:val="26"/>
-          <w:szCs w:val="26"/>
-          <w:shd w:fill="1F4E47" w:color="auto" w:val="clear"/>
-        </w:rPr>
-        <w:t xml:space="preserve"> 2.1 </w:t>
-      </w:r>
-      <w:r>
-        <w:rPr>
-          <w:rFonts w:ascii="Arial" w:cs="Arial" w:eastAsia="Arial" w:hAnsi="Arial"/>
-          <w:b/>
-          <w:bCs/>
-          <w:color w:val="1F4E47"/>
+          <w:rFonts w:ascii="Cambria" w:cs="Cambria" w:eastAsia="Cambria" w:hAnsi="Cambria"/>
+          <w:i/>
+          <w:iCs/>
+          <w:color w:val="A67C3D"/>
           <w:sz w:val="30"/>
           <w:szCs w:val="30"/>
         </w:rPr>
-        <w:t xml:space="preserve">  Thiết bị</w:t>
+        <w:t xml:space="preserve">2.1</w:t>
+      </w:r>
+      <w:r>
+        <w:rPr>
+          <w:rFonts w:ascii="Cambria" w:cs="Cambria" w:eastAsia="Cambria" w:hAnsi="Cambria"/>
+          <w:color w:val="1B1F24"/>
+          <w:sz w:val="32"/>
+          <w:szCs w:val="32"/>
+        </w:rPr>
+        <w:t xml:space="preserve">   Thiết bị</w:t>
       </w:r>
     </w:p>
     <w:p>
@@ -694,7 +679,7 @@
           <w:rFonts w:ascii="Arial" w:cs="Arial" w:eastAsia="Arial" w:hAnsi="Arial"/>
           <w:b/>
           <w:bCs/>
-          <w:color w:val="1F4E47"/>
+          <w:color w:val="1B1F24"/>
           <w:sz w:val="22"/>
           <w:szCs w:val="22"/>
         </w:rPr>
@@ -703,7 +688,7 @@
       <w:r>
         <w:rPr>
           <w:rFonts w:ascii="Arial" w:cs="Arial" w:eastAsia="Arial" w:hAnsi="Arial"/>
-          <w:color w:val="1F4E47"/>
+          <w:color w:val="1B1F24"/>
           <w:sz w:val="22"/>
           <w:szCs w:val="22"/>
         </w:rPr>
@@ -724,7 +709,7 @@
           <w:rFonts w:ascii="Arial" w:cs="Arial" w:eastAsia="Arial" w:hAnsi="Arial"/>
           <w:b/>
           <w:bCs/>
-          <w:color w:val="1F4E47"/>
+          <w:color w:val="1B1F24"/>
           <w:sz w:val="22"/>
           <w:szCs w:val="22"/>
         </w:rPr>
@@ -733,7 +718,7 @@
       <w:r>
         <w:rPr>
           <w:rFonts w:ascii="Arial" w:cs="Arial" w:eastAsia="Arial" w:hAnsi="Arial"/>
-          <w:color w:val="1F4E47"/>
+          <w:color w:val="1B1F24"/>
           <w:sz w:val="22"/>
           <w:szCs w:val="22"/>
         </w:rPr>
@@ -754,7 +739,7 @@
           <w:rFonts w:ascii="Arial" w:cs="Arial" w:eastAsia="Arial" w:hAnsi="Arial"/>
           <w:b/>
           <w:bCs/>
-          <w:color w:val="1F4E47"/>
+          <w:color w:val="1B1F24"/>
           <w:sz w:val="22"/>
           <w:szCs w:val="22"/>
         </w:rPr>
@@ -763,7 +748,7 @@
       <w:r>
         <w:rPr>
           <w:rFonts w:ascii="Arial" w:cs="Arial" w:eastAsia="Arial" w:hAnsi="Arial"/>
-          <w:color w:val="1F4E47"/>
+          <w:color w:val="1B1F24"/>
           <w:sz w:val="22"/>
           <w:szCs w:val="22"/>
         </w:rPr>
@@ -783,26 +768,23 @@
       </w:pPr>
       <w:r>
         <w:rPr>
-          <w:rFonts w:ascii="Arial" w:cs="Arial" w:eastAsia="Arial" w:hAnsi="Arial"/>
-          <w:b/>
-          <w:bCs/>
-          <w:color w:val="F2B134"/>
-          <w:sz w:val="26"/>
-          <w:szCs w:val="26"/>
-          <w:shd w:fill="1F4E47" w:color="auto" w:val="clear"/>
-        </w:rPr>
-        <w:t xml:space="preserve"> 2.2 </w:t>
-      </w:r>
-      <w:r>
-        <w:rPr>
-          <w:rFonts w:ascii="Arial" w:cs="Arial" w:eastAsia="Arial" w:hAnsi="Arial"/>
-          <w:b/>
-          <w:bCs/>
-          <w:color w:val="1F4E47"/>
+          <w:rFonts w:ascii="Cambria" w:cs="Cambria" w:eastAsia="Cambria" w:hAnsi="Cambria"/>
+          <w:i/>
+          <w:iCs/>
+          <w:color w:val="A67C3D"/>
           <w:sz w:val="30"/>
           <w:szCs w:val="30"/>
         </w:rPr>
-        <w:t xml:space="preserve">  Các công cụ dùng trong sách</w:t>
+        <w:t xml:space="preserve">2.2</w:t>
+      </w:r>
+      <w:r>
+        <w:rPr>
+          <w:rFonts w:ascii="Cambria" w:cs="Cambria" w:eastAsia="Cambria" w:hAnsi="Cambria"/>
+          <w:color w:val="1B1F24"/>
+          <w:sz w:val="32"/>
+          <w:szCs w:val="32"/>
+        </w:rPr>
+        <w:t xml:space="preserve">   Các công cụ dùng trong sách</w:t>
       </w:r>
     </w:p>
     <w:tbl>
@@ -835,7 +817,7 @@
               <w:bottom w:val="none" w:color="FFFFFF" w:sz="0"/>
               <w:right w:val="none" w:color="FFFFFF" w:sz="0"/>
             </w:tcBorders>
-            <w:shd w:fill="1F4E47" w:color="auto" w:val="clear"/>
+            <w:shd w:fill="1B1F24" w:color="auto" w:val="clear"/>
             <w:tcMar>
               <w:top w:type="dxa" w:w="90"/>
               <w:left w:type="dxa" w:w="160"/>
@@ -866,7 +848,7 @@
               <w:bottom w:val="none" w:color="FFFFFF" w:sz="0"/>
               <w:right w:val="none" w:color="FFFFFF" w:sz="0"/>
             </w:tcBorders>
-            <w:shd w:fill="1F4E47" w:color="auto" w:val="clear"/>
+            <w:shd w:fill="1B1F24" w:color="auto" w:val="clear"/>
             <w:tcMar>
               <w:top w:type="dxa" w:w="90"/>
               <w:left w:type="dxa" w:w="160"/>
@@ -897,7 +879,7 @@
               <w:bottom w:val="none" w:color="FFFFFF" w:sz="0"/>
               <w:right w:val="none" w:color="FFFFFF" w:sz="0"/>
             </w:tcBorders>
-            <w:shd w:fill="1F4E47" w:color="auto" w:val="clear"/>
+            <w:shd w:fill="1B1F24" w:color="auto" w:val="clear"/>
             <w:tcMar>
               <w:top w:type="dxa" w:w="90"/>
               <w:left w:type="dxa" w:w="160"/>
@@ -930,7 +912,7 @@
               <w:bottom w:val="none" w:color="FFFFFF" w:sz="0"/>
               <w:right w:val="none" w:color="FFFFFF" w:sz="0"/>
             </w:tcBorders>
-            <w:shd w:fill="E9EFEE" w:color="auto" w:val="clear"/>
+            <w:shd w:fill="F7F5F0" w:color="auto" w:val="clear"/>
             <w:tcMar>
               <w:top w:type="dxa" w:w="90"/>
               <w:left w:type="dxa" w:w="160"/>
@@ -944,7 +926,7 @@
                 <w:rFonts w:ascii="Arial" w:cs="Arial" w:eastAsia="Arial" w:hAnsi="Arial"/>
                 <w:b/>
                 <w:bCs/>
-                <w:color w:val="1F4E47"/>
+                <w:color w:val="1B1F24"/>
                 <w:sz w:val="20"/>
                 <w:szCs w:val="20"/>
               </w:rPr>
@@ -961,7 +943,7 @@
               <w:bottom w:val="none" w:color="FFFFFF" w:sz="0"/>
               <w:right w:val="none" w:color="FFFFFF" w:sz="0"/>
             </w:tcBorders>
-            <w:shd w:fill="E9EFEE" w:color="auto" w:val="clear"/>
+            <w:shd w:fill="F7F5F0" w:color="auto" w:val="clear"/>
             <w:tcMar>
               <w:top w:type="dxa" w:w="90"/>
               <w:left w:type="dxa" w:w="160"/>
@@ -975,7 +957,7 @@
                 <w:rFonts w:ascii="Arial" w:cs="Arial" w:eastAsia="Arial" w:hAnsi="Arial"/>
                 <w:b w:val="false"/>
                 <w:bCs w:val="false"/>
-                <w:color w:val="1F4E47"/>
+                <w:color w:val="1B1F24"/>
                 <w:sz w:val="20"/>
                 <w:szCs w:val="20"/>
               </w:rPr>
@@ -992,7 +974,7 @@
               <w:bottom w:val="none" w:color="FFFFFF" w:sz="0"/>
               <w:right w:val="none" w:color="FFFFFF" w:sz="0"/>
             </w:tcBorders>
-            <w:shd w:fill="E9EFEE" w:color="auto" w:val="clear"/>
+            <w:shd w:fill="F7F5F0" w:color="auto" w:val="clear"/>
             <w:tcMar>
               <w:top w:type="dxa" w:w="90"/>
               <w:left w:type="dxa" w:w="160"/>
@@ -1006,7 +988,7 @@
                 <w:rFonts w:ascii="Arial" w:cs="Arial" w:eastAsia="Arial" w:hAnsi="Arial"/>
                 <w:b w:val="false"/>
                 <w:bCs w:val="false"/>
-                <w:color w:val="1F4E47"/>
+                <w:color w:val="1B1F24"/>
                 <w:sz w:val="20"/>
                 <w:szCs w:val="20"/>
               </w:rPr>
@@ -1039,7 +1021,7 @@
                 <w:rFonts w:ascii="Arial" w:cs="Arial" w:eastAsia="Arial" w:hAnsi="Arial"/>
                 <w:b/>
                 <w:bCs/>
-                <w:color w:val="1F4E47"/>
+                <w:color w:val="1B1F24"/>
                 <w:sz w:val="20"/>
                 <w:szCs w:val="20"/>
               </w:rPr>
@@ -1070,7 +1052,7 @@
                 <w:rFonts w:ascii="Arial" w:cs="Arial" w:eastAsia="Arial" w:hAnsi="Arial"/>
                 <w:b w:val="false"/>
                 <w:bCs w:val="false"/>
-                <w:color w:val="1F4E47"/>
+                <w:color w:val="1B1F24"/>
                 <w:sz w:val="20"/>
                 <w:szCs w:val="20"/>
               </w:rPr>
@@ -1101,7 +1083,7 @@
                 <w:rFonts w:ascii="Arial" w:cs="Arial" w:eastAsia="Arial" w:hAnsi="Arial"/>
                 <w:b w:val="false"/>
                 <w:bCs w:val="false"/>
-                <w:color w:val="1F4E47"/>
+                <w:color w:val="1B1F24"/>
                 <w:sz w:val="20"/>
                 <w:szCs w:val="20"/>
               </w:rPr>
@@ -1120,7 +1102,7 @@
               <w:bottom w:val="none" w:color="FFFFFF" w:sz="0"/>
               <w:right w:val="none" w:color="FFFFFF" w:sz="0"/>
             </w:tcBorders>
-            <w:shd w:fill="E9EFEE" w:color="auto" w:val="clear"/>
+            <w:shd w:fill="F7F5F0" w:color="auto" w:val="clear"/>
             <w:tcMar>
               <w:top w:type="dxa" w:w="90"/>
               <w:left w:type="dxa" w:w="160"/>
@@ -1134,7 +1116,7 @@
                 <w:rFonts w:ascii="Arial" w:cs="Arial" w:eastAsia="Arial" w:hAnsi="Arial"/>
                 <w:b/>
                 <w:bCs/>
-                <w:color w:val="1F4E47"/>
+                <w:color w:val="1B1F24"/>
                 <w:sz w:val="20"/>
                 <w:szCs w:val="20"/>
               </w:rPr>
@@ -1151,7 +1133,7 @@
               <w:bottom w:val="none" w:color="FFFFFF" w:sz="0"/>
               <w:right w:val="none" w:color="FFFFFF" w:sz="0"/>
             </w:tcBorders>
-            <w:shd w:fill="E9EFEE" w:color="auto" w:val="clear"/>
+            <w:shd w:fill="F7F5F0" w:color="auto" w:val="clear"/>
             <w:tcMar>
               <w:top w:type="dxa" w:w="90"/>
               <w:left w:type="dxa" w:w="160"/>
@@ -1165,7 +1147,7 @@
                 <w:rFonts w:ascii="Arial" w:cs="Arial" w:eastAsia="Arial" w:hAnsi="Arial"/>
                 <w:b w:val="false"/>
                 <w:bCs w:val="false"/>
-                <w:color w:val="1F4E47"/>
+                <w:color w:val="1B1F24"/>
                 <w:sz w:val="20"/>
                 <w:szCs w:val="20"/>
               </w:rPr>
@@ -1182,7 +1164,7 @@
               <w:bottom w:val="none" w:color="FFFFFF" w:sz="0"/>
               <w:right w:val="none" w:color="FFFFFF" w:sz="0"/>
             </w:tcBorders>
-            <w:shd w:fill="E9EFEE" w:color="auto" w:val="clear"/>
+            <w:shd w:fill="F7F5F0" w:color="auto" w:val="clear"/>
             <w:tcMar>
               <w:top w:type="dxa" w:w="90"/>
               <w:left w:type="dxa" w:w="160"/>
@@ -1196,7 +1178,7 @@
                 <w:rFonts w:ascii="Arial" w:cs="Arial" w:eastAsia="Arial" w:hAnsi="Arial"/>
                 <w:b w:val="false"/>
                 <w:bCs w:val="false"/>
-                <w:color w:val="1F4E47"/>
+                <w:color w:val="1B1F24"/>
                 <w:sz w:val="20"/>
                 <w:szCs w:val="20"/>
               </w:rPr>
@@ -1229,7 +1211,7 @@
                 <w:rFonts w:ascii="Arial" w:cs="Arial" w:eastAsia="Arial" w:hAnsi="Arial"/>
                 <w:b/>
                 <w:bCs/>
-                <w:color w:val="1F4E47"/>
+                <w:color w:val="1B1F24"/>
                 <w:sz w:val="20"/>
                 <w:szCs w:val="20"/>
               </w:rPr>
@@ -1260,7 +1242,7 @@
                 <w:rFonts w:ascii="Arial" w:cs="Arial" w:eastAsia="Arial" w:hAnsi="Arial"/>
                 <w:b w:val="false"/>
                 <w:bCs w:val="false"/>
-                <w:color w:val="1F4E47"/>
+                <w:color w:val="1B1F24"/>
                 <w:sz w:val="20"/>
                 <w:szCs w:val="20"/>
               </w:rPr>
@@ -1291,7 +1273,7 @@
                 <w:rFonts w:ascii="Arial" w:cs="Arial" w:eastAsia="Arial" w:hAnsi="Arial"/>
                 <w:b w:val="false"/>
                 <w:bCs w:val="false"/>
-                <w:color w:val="1F4E47"/>
+                <w:color w:val="1B1F24"/>
                 <w:sz w:val="20"/>
                 <w:szCs w:val="20"/>
               </w:rPr>
@@ -1310,7 +1292,7 @@
               <w:bottom w:val="none" w:color="FFFFFF" w:sz="0"/>
               <w:right w:val="none" w:color="FFFFFF" w:sz="0"/>
             </w:tcBorders>
-            <w:shd w:fill="E9EFEE" w:color="auto" w:val="clear"/>
+            <w:shd w:fill="F7F5F0" w:color="auto" w:val="clear"/>
             <w:tcMar>
               <w:top w:type="dxa" w:w="90"/>
               <w:left w:type="dxa" w:w="160"/>
@@ -1324,7 +1306,7 @@
                 <w:rFonts w:ascii="Arial" w:cs="Arial" w:eastAsia="Arial" w:hAnsi="Arial"/>
                 <w:b/>
                 <w:bCs/>
-                <w:color w:val="1F4E47"/>
+                <w:color w:val="1B1F24"/>
                 <w:sz w:val="20"/>
                 <w:szCs w:val="20"/>
               </w:rPr>
@@ -1341,7 +1323,7 @@
               <w:bottom w:val="none" w:color="FFFFFF" w:sz="0"/>
               <w:right w:val="none" w:color="FFFFFF" w:sz="0"/>
             </w:tcBorders>
-            <w:shd w:fill="E9EFEE" w:color="auto" w:val="clear"/>
+            <w:shd w:fill="F7F5F0" w:color="auto" w:val="clear"/>
             <w:tcMar>
               <w:top w:type="dxa" w:w="90"/>
               <w:left w:type="dxa" w:w="160"/>
@@ -1355,7 +1337,7 @@
                 <w:rFonts w:ascii="Arial" w:cs="Arial" w:eastAsia="Arial" w:hAnsi="Arial"/>
                 <w:b w:val="false"/>
                 <w:bCs w:val="false"/>
-                <w:color w:val="1F4E47"/>
+                <w:color w:val="1B1F24"/>
                 <w:sz w:val="20"/>
                 <w:szCs w:val="20"/>
               </w:rPr>
@@ -1372,7 +1354,7 @@
               <w:bottom w:val="none" w:color="FFFFFF" w:sz="0"/>
               <w:right w:val="none" w:color="FFFFFF" w:sz="0"/>
             </w:tcBorders>
-            <w:shd w:fill="E9EFEE" w:color="auto" w:val="clear"/>
+            <w:shd w:fill="F7F5F0" w:color="auto" w:val="clear"/>
             <w:tcMar>
               <w:top w:type="dxa" w:w="90"/>
               <w:left w:type="dxa" w:w="160"/>
@@ -1386,7 +1368,7 @@
                 <w:rFonts w:ascii="Arial" w:cs="Arial" w:eastAsia="Arial" w:hAnsi="Arial"/>
                 <w:b w:val="false"/>
                 <w:bCs w:val="false"/>
-                <w:color w:val="1F4E47"/>
+                <w:color w:val="1B1F24"/>
                 <w:sz w:val="20"/>
                 <w:szCs w:val="20"/>
               </w:rPr>
@@ -1419,7 +1401,7 @@
                 <w:rFonts w:ascii="Arial" w:cs="Arial" w:eastAsia="Arial" w:hAnsi="Arial"/>
                 <w:b/>
                 <w:bCs/>
-                <w:color w:val="1F4E47"/>
+                <w:color w:val="1B1F24"/>
                 <w:sz w:val="20"/>
                 <w:szCs w:val="20"/>
               </w:rPr>
@@ -1450,7 +1432,7 @@
                 <w:rFonts w:ascii="Arial" w:cs="Arial" w:eastAsia="Arial" w:hAnsi="Arial"/>
                 <w:b w:val="false"/>
                 <w:bCs w:val="false"/>
-                <w:color w:val="1F4E47"/>
+                <w:color w:val="1B1F24"/>
                 <w:sz w:val="20"/>
                 <w:szCs w:val="20"/>
               </w:rPr>
@@ -1481,7 +1463,7 @@
                 <w:rFonts w:ascii="Arial" w:cs="Arial" w:eastAsia="Arial" w:hAnsi="Arial"/>
                 <w:b w:val="false"/>
                 <w:bCs w:val="false"/>
-                <w:color w:val="1F4E47"/>
+                <w:color w:val="1B1F24"/>
                 <w:sz w:val="20"/>
                 <w:szCs w:val="20"/>
               </w:rPr>
@@ -1500,7 +1482,7 @@
               <w:bottom w:val="none" w:color="FFFFFF" w:sz="0"/>
               <w:right w:val="none" w:color="FFFFFF" w:sz="0"/>
             </w:tcBorders>
-            <w:shd w:fill="E9EFEE" w:color="auto" w:val="clear"/>
+            <w:shd w:fill="F7F5F0" w:color="auto" w:val="clear"/>
             <w:tcMar>
               <w:top w:type="dxa" w:w="90"/>
               <w:left w:type="dxa" w:w="160"/>
@@ -1514,7 +1496,7 @@
                 <w:rFonts w:ascii="Arial" w:cs="Arial" w:eastAsia="Arial" w:hAnsi="Arial"/>
                 <w:b/>
                 <w:bCs/>
-                <w:color w:val="1F4E47"/>
+                <w:color w:val="1B1F24"/>
                 <w:sz w:val="20"/>
                 <w:szCs w:val="20"/>
               </w:rPr>
@@ -1531,7 +1513,7 @@
               <w:bottom w:val="none" w:color="FFFFFF" w:sz="0"/>
               <w:right w:val="none" w:color="FFFFFF" w:sz="0"/>
             </w:tcBorders>
-            <w:shd w:fill="E9EFEE" w:color="auto" w:val="clear"/>
+            <w:shd w:fill="F7F5F0" w:color="auto" w:val="clear"/>
             <w:tcMar>
               <w:top w:type="dxa" w:w="90"/>
               <w:left w:type="dxa" w:w="160"/>
@@ -1545,7 +1527,7 @@
                 <w:rFonts w:ascii="Arial" w:cs="Arial" w:eastAsia="Arial" w:hAnsi="Arial"/>
                 <w:b w:val="false"/>
                 <w:bCs w:val="false"/>
-                <w:color w:val="1F4E47"/>
+                <w:color w:val="1B1F24"/>
                 <w:sz w:val="20"/>
                 <w:szCs w:val="20"/>
               </w:rPr>
@@ -1562,7 +1544,7 @@
               <w:bottom w:val="none" w:color="FFFFFF" w:sz="0"/>
               <w:right w:val="none" w:color="FFFFFF" w:sz="0"/>
             </w:tcBorders>
-            <w:shd w:fill="E9EFEE" w:color="auto" w:val="clear"/>
+            <w:shd w:fill="F7F5F0" w:color="auto" w:val="clear"/>
             <w:tcMar>
               <w:top w:type="dxa" w:w="90"/>
               <w:left w:type="dxa" w:w="160"/>
@@ -1576,7 +1558,7 @@
                 <w:rFonts w:ascii="Arial" w:cs="Arial" w:eastAsia="Arial" w:hAnsi="Arial"/>
                 <w:b w:val="false"/>
                 <w:bCs w:val="false"/>
-                <w:color w:val="1F4E47"/>
+                <w:color w:val="1B1F24"/>
                 <w:sz w:val="20"/>
                 <w:szCs w:val="20"/>
               </w:rPr>
@@ -1609,7 +1591,7 @@
                 <w:rFonts w:ascii="Arial" w:cs="Arial" w:eastAsia="Arial" w:hAnsi="Arial"/>
                 <w:b/>
                 <w:bCs/>
-                <w:color w:val="1F4E47"/>
+                <w:color w:val="1B1F24"/>
                 <w:sz w:val="20"/>
                 <w:szCs w:val="20"/>
               </w:rPr>
@@ -1640,7 +1622,7 @@
                 <w:rFonts w:ascii="Arial" w:cs="Arial" w:eastAsia="Arial" w:hAnsi="Arial"/>
                 <w:b w:val="false"/>
                 <w:bCs w:val="false"/>
-                <w:color w:val="1F4E47"/>
+                <w:color w:val="1B1F24"/>
                 <w:sz w:val="20"/>
                 <w:szCs w:val="20"/>
               </w:rPr>
@@ -1671,7 +1653,7 @@
                 <w:rFonts w:ascii="Arial" w:cs="Arial" w:eastAsia="Arial" w:hAnsi="Arial"/>
                 <w:b w:val="false"/>
                 <w:bCs w:val="false"/>
-                <w:color w:val="1F4E47"/>
+                <w:color w:val="1B1F24"/>
                 <w:sz w:val="20"/>
                 <w:szCs w:val="20"/>
               </w:rPr>
@@ -1690,7 +1672,7 @@
               <w:bottom w:val="none" w:color="FFFFFF" w:sz="0"/>
               <w:right w:val="none" w:color="FFFFFF" w:sz="0"/>
             </w:tcBorders>
-            <w:shd w:fill="E9EFEE" w:color="auto" w:val="clear"/>
+            <w:shd w:fill="F7F5F0" w:color="auto" w:val="clear"/>
             <w:tcMar>
               <w:top w:type="dxa" w:w="90"/>
               <w:left w:type="dxa" w:w="160"/>
@@ -1704,7 +1686,7 @@
                 <w:rFonts w:ascii="Arial" w:cs="Arial" w:eastAsia="Arial" w:hAnsi="Arial"/>
                 <w:b/>
                 <w:bCs/>
-                <w:color w:val="1F4E47"/>
+                <w:color w:val="1B1F24"/>
                 <w:sz w:val="20"/>
                 <w:szCs w:val="20"/>
               </w:rPr>
@@ -1721,7 +1703,7 @@
               <w:bottom w:val="none" w:color="FFFFFF" w:sz="0"/>
               <w:right w:val="none" w:color="FFFFFF" w:sz="0"/>
             </w:tcBorders>
-            <w:shd w:fill="E9EFEE" w:color="auto" w:val="clear"/>
+            <w:shd w:fill="F7F5F0" w:color="auto" w:val="clear"/>
             <w:tcMar>
               <w:top w:type="dxa" w:w="90"/>
               <w:left w:type="dxa" w:w="160"/>
@@ -1735,7 +1717,7 @@
                 <w:rFonts w:ascii="Arial" w:cs="Arial" w:eastAsia="Arial" w:hAnsi="Arial"/>
                 <w:b w:val="false"/>
                 <w:bCs w:val="false"/>
-                <w:color w:val="1F4E47"/>
+                <w:color w:val="1B1F24"/>
                 <w:sz w:val="20"/>
                 <w:szCs w:val="20"/>
               </w:rPr>
@@ -1752,7 +1734,7 @@
               <w:bottom w:val="none" w:color="FFFFFF" w:sz="0"/>
               <w:right w:val="none" w:color="FFFFFF" w:sz="0"/>
             </w:tcBorders>
-            <w:shd w:fill="E9EFEE" w:color="auto" w:val="clear"/>
+            <w:shd w:fill="F7F5F0" w:color="auto" w:val="clear"/>
             <w:tcMar>
               <w:top w:type="dxa" w:w="90"/>
               <w:left w:type="dxa" w:w="160"/>
@@ -1766,7 +1748,7 @@
                 <w:rFonts w:ascii="Arial" w:cs="Arial" w:eastAsia="Arial" w:hAnsi="Arial"/>
                 <w:b w:val="false"/>
                 <w:bCs w:val="false"/>
-                <w:color w:val="1F4E47"/>
+                <w:color w:val="1B1F24"/>
                 <w:sz w:val="20"/>
                 <w:szCs w:val="20"/>
               </w:rPr>
@@ -1791,7 +1773,7 @@
           <w:rFonts w:ascii="Arial" w:cs="Arial" w:eastAsia="Arial" w:hAnsi="Arial"/>
           <w:b/>
           <w:bCs/>
-          <w:color w:val="B07A12"/>
+          <w:color w:val="A67C3D"/>
           <w:sz w:val="20"/>
           <w:szCs w:val="20"/>
         </w:rPr>
@@ -1800,7 +1782,7 @@
       <w:r>
         <w:rPr>
           <w:rFonts w:ascii="Arial" w:cs="Arial" w:eastAsia="Arial" w:hAnsi="Arial"/>
-          <w:color w:val="1F4E47"/>
+          <w:color w:val="1B1F24"/>
           <w:sz w:val="21"/>
           <w:szCs w:val="21"/>
         </w:rPr>
@@ -1811,7 +1793,7 @@
           <w:rFonts w:ascii="Arial" w:cs="Arial" w:eastAsia="Arial" w:hAnsi="Arial"/>
           <w:b/>
           <w:bCs/>
-          <w:color w:val="1F4E47"/>
+          <w:color w:val="1B1F24"/>
           <w:sz w:val="21"/>
           <w:szCs w:val="21"/>
         </w:rPr>
@@ -1820,7 +1802,7 @@
       <w:r>
         <w:rPr>
           <w:rFonts w:ascii="Arial" w:cs="Arial" w:eastAsia="Arial" w:hAnsi="Arial"/>
-          <w:color w:val="1F4E47"/>
+          <w:color w:val="1B1F24"/>
           <w:sz w:val="21"/>
           <w:szCs w:val="21"/>
         </w:rPr>
@@ -1835,26 +1817,23 @@
       </w:pPr>
       <w:r>
         <w:rPr>
-          <w:rFonts w:ascii="Arial" w:cs="Arial" w:eastAsia="Arial" w:hAnsi="Arial"/>
-          <w:b/>
-          <w:bCs/>
-          <w:color w:val="F2B134"/>
-          <w:sz w:val="26"/>
-          <w:szCs w:val="26"/>
-          <w:shd w:fill="1F4E47" w:color="auto" w:val="clear"/>
-        </w:rPr>
-        <w:t xml:space="preserve"> 2.3 </w:t>
-      </w:r>
-      <w:r>
-        <w:rPr>
-          <w:rFonts w:ascii="Arial" w:cs="Arial" w:eastAsia="Arial" w:hAnsi="Arial"/>
-          <w:b/>
-          <w:bCs/>
-          <w:color w:val="1F4E47"/>
+          <w:rFonts w:ascii="Cambria" w:cs="Cambria" w:eastAsia="Cambria" w:hAnsi="Cambria"/>
+          <w:i/>
+          <w:iCs/>
+          <w:color w:val="A67C3D"/>
           <w:sz w:val="30"/>
           <w:szCs w:val="30"/>
         </w:rPr>
-        <w:t xml:space="preserve">  Không nên cài hay mua gì trước</w:t>
+        <w:t xml:space="preserve">2.3</w:t>
+      </w:r>
+      <w:r>
+        <w:rPr>
+          <w:rFonts w:ascii="Cambria" w:cs="Cambria" w:eastAsia="Cambria" w:hAnsi="Cambria"/>
+          <w:color w:val="1B1F24"/>
+          <w:sz w:val="32"/>
+          <w:szCs w:val="32"/>
+        </w:rPr>
+        <w:t xml:space="preserve">   Không nên cài hay mua gì trước</w:t>
       </w:r>
     </w:p>
     <w:p>
@@ -1864,7 +1843,7 @@
       <w:r>
         <w:rPr>
           <w:rFonts w:ascii="Arial" w:cs="Arial" w:eastAsia="Arial" w:hAnsi="Arial"/>
-          <w:color w:val="1F4E47"/>
+          <w:color w:val="1B1F24"/>
           <w:sz w:val="22"/>
           <w:szCs w:val="22"/>
         </w:rPr>
@@ -1878,14 +1857,12 @@
       <w:r>
         <w:rPr>
           <w:rFonts w:ascii="Arial" w:cs="Arial" w:eastAsia="Arial" w:hAnsi="Arial"/>
-          <w:b/>
-          <w:bCs/>
-          <w:color w:val="1F4E47"/>
-          <w:sz w:val="22"/>
-          <w:szCs w:val="22"/>
-          <w:shd w:fill="F2B134" w:color="auto" w:val="clear"/>
-        </w:rPr>
-        <w:t xml:space="preserve"> MỤC 3 </w:t>
+          <w:color w:val="A67C3D"/>
+          <w:spacing w:val="60"/>
+          <w:sz w:val="18"/>
+          <w:szCs w:val="18"/>
+        </w:rPr>
+        <w:t xml:space="preserve">MỤC 3</w:t>
       </w:r>
     </w:p>
     <w:p>
@@ -1895,12 +1872,10 @@
       </w:pPr>
       <w:r>
         <w:rPr>
-          <w:rFonts w:ascii="Arial" w:cs="Arial" w:eastAsia="Arial" w:hAnsi="Arial"/>
-          <w:b/>
-          <w:bCs/>
-          <w:color w:val="1F4E47"/>
-          <w:sz w:val="44"/>
-          <w:szCs w:val="44"/>
+          <w:rFonts w:ascii="Cambria" w:cs="Cambria" w:eastAsia="Cambria" w:hAnsi="Cambria"/>
+          <w:color w:val="1B1F24"/>
+          <w:sz w:val="48"/>
+          <w:szCs w:val="48"/>
         </w:rPr>
         <w:t xml:space="preserve">Thiết lập an toàn ngay từ đầu</w:t>
       </w:r>
@@ -1914,7 +1889,7 @@
           <w:rFonts w:ascii="Arial" w:cs="Arial" w:eastAsia="Arial" w:hAnsi="Arial"/>
           <w:i/>
           <w:iCs/>
-          <w:color w:val="1F4E47"/>
+          <w:color w:val="1B1F24"/>
           <w:sz w:val="22"/>
           <w:szCs w:val="22"/>
         </w:rPr>
@@ -1929,26 +1904,23 @@
       </w:pPr>
       <w:r>
         <w:rPr>
-          <w:rFonts w:ascii="Arial" w:cs="Arial" w:eastAsia="Arial" w:hAnsi="Arial"/>
-          <w:b/>
-          <w:bCs/>
-          <w:color w:val="F2B134"/>
-          <w:sz w:val="26"/>
-          <w:szCs w:val="26"/>
-          <w:shd w:fill="1F4E47" w:color="auto" w:val="clear"/>
-        </w:rPr>
-        <w:t xml:space="preserve"> 3.1 </w:t>
-      </w:r>
-      <w:r>
-        <w:rPr>
-          <w:rFonts w:ascii="Arial" w:cs="Arial" w:eastAsia="Arial" w:hAnsi="Arial"/>
-          <w:b/>
-          <w:bCs/>
-          <w:color w:val="1F4E47"/>
+          <w:rFonts w:ascii="Cambria" w:cs="Cambria" w:eastAsia="Cambria" w:hAnsi="Cambria"/>
+          <w:i/>
+          <w:iCs/>
+          <w:color w:val="A67C3D"/>
           <w:sz w:val="30"/>
           <w:szCs w:val="30"/>
         </w:rPr>
-        <w:t xml:space="preserve">  Hạn chế dùng cuộc trò chuyện của mình để huấn luyện AI</w:t>
+        <w:t xml:space="preserve">3.1</w:t>
+      </w:r>
+      <w:r>
+        <w:rPr>
+          <w:rFonts w:ascii="Cambria" w:cs="Cambria" w:eastAsia="Cambria" w:hAnsi="Cambria"/>
+          <w:color w:val="1B1F24"/>
+          <w:sz w:val="32"/>
+          <w:szCs w:val="32"/>
+        </w:rPr>
+        <w:t xml:space="preserve">   Hạn chế dùng cuộc trò chuyện của mình để huấn luyện AI</w:t>
       </w:r>
     </w:p>
     <w:p>
@@ -1965,7 +1937,7 @@
           <w:rFonts w:ascii="Arial" w:cs="Arial" w:eastAsia="Arial" w:hAnsi="Arial"/>
           <w:b/>
           <w:bCs/>
-          <w:color w:val="1F4E47"/>
+          <w:color w:val="1B1F24"/>
           <w:sz w:val="22"/>
           <w:szCs w:val="22"/>
         </w:rPr>
@@ -1974,7 +1946,7 @@
       <w:r>
         <w:rPr>
           <w:rFonts w:ascii="Arial" w:cs="Arial" w:eastAsia="Arial" w:hAnsi="Arial"/>
-          <w:color w:val="1F4E47"/>
+          <w:color w:val="1B1F24"/>
           <w:sz w:val="22"/>
           <w:szCs w:val="22"/>
         </w:rPr>
@@ -1985,7 +1957,7 @@
           <w:rFonts w:ascii="Arial" w:cs="Arial" w:eastAsia="Arial" w:hAnsi="Arial"/>
           <w:b/>
           <w:bCs/>
-          <w:color w:val="1F4E47"/>
+          <w:color w:val="1B1F24"/>
           <w:sz w:val="22"/>
           <w:szCs w:val="22"/>
         </w:rPr>
@@ -1994,7 +1966,7 @@
       <w:r>
         <w:rPr>
           <w:rFonts w:ascii="Arial" w:cs="Arial" w:eastAsia="Arial" w:hAnsi="Arial"/>
-          <w:color w:val="1F4E47"/>
+          <w:color w:val="1B1F24"/>
           <w:sz w:val="22"/>
           <w:szCs w:val="22"/>
         </w:rPr>
@@ -2005,7 +1977,7 @@
           <w:rFonts w:ascii="Arial" w:cs="Arial" w:eastAsia="Arial" w:hAnsi="Arial"/>
           <w:b/>
           <w:bCs/>
-          <w:color w:val="1F4E47"/>
+          <w:color w:val="1B1F24"/>
           <w:sz w:val="22"/>
           <w:szCs w:val="22"/>
         </w:rPr>
@@ -2014,7 +1986,7 @@
       <w:r>
         <w:rPr>
           <w:rFonts w:ascii="Arial" w:cs="Arial" w:eastAsia="Arial" w:hAnsi="Arial"/>
-          <w:color w:val="1F4E47"/>
+          <w:color w:val="1B1F24"/>
           <w:sz w:val="22"/>
           <w:szCs w:val="22"/>
         </w:rPr>
@@ -2025,7 +1997,7 @@
           <w:rFonts w:ascii="Arial" w:cs="Arial" w:eastAsia="Arial" w:hAnsi="Arial"/>
           <w:b/>
           <w:bCs/>
-          <w:color w:val="1F4E47"/>
+          <w:color w:val="1B1F24"/>
           <w:sz w:val="22"/>
           <w:szCs w:val="22"/>
         </w:rPr>
@@ -2034,7 +2006,7 @@
       <w:r>
         <w:rPr>
           <w:rFonts w:ascii="Arial" w:cs="Arial" w:eastAsia="Arial" w:hAnsi="Arial"/>
-          <w:color w:val="1F4E47"/>
+          <w:color w:val="1B1F24"/>
           <w:sz w:val="22"/>
           <w:szCs w:val="22"/>
         </w:rPr>
@@ -2055,7 +2027,7 @@
           <w:rFonts w:ascii="Arial" w:cs="Arial" w:eastAsia="Arial" w:hAnsi="Arial"/>
           <w:b/>
           <w:bCs/>
-          <w:color w:val="1F4E47"/>
+          <w:color w:val="1B1F24"/>
           <w:sz w:val="22"/>
           <w:szCs w:val="22"/>
         </w:rPr>
@@ -2064,7 +2036,7 @@
       <w:r>
         <w:rPr>
           <w:rFonts w:ascii="Arial" w:cs="Arial" w:eastAsia="Arial" w:hAnsi="Arial"/>
-          <w:color w:val="1F4E47"/>
+          <w:color w:val="1B1F24"/>
           <w:sz w:val="22"/>
           <w:szCs w:val="22"/>
         </w:rPr>
@@ -2075,7 +2047,7 @@
           <w:rFonts w:ascii="Arial" w:cs="Arial" w:eastAsia="Arial" w:hAnsi="Arial"/>
           <w:b/>
           <w:bCs/>
-          <w:color w:val="1F4E47"/>
+          <w:color w:val="1B1F24"/>
           <w:sz w:val="22"/>
           <w:szCs w:val="22"/>
         </w:rPr>
@@ -2084,7 +2056,7 @@
       <w:r>
         <w:rPr>
           <w:rFonts w:ascii="Arial" w:cs="Arial" w:eastAsia="Arial" w:hAnsi="Arial"/>
-          <w:color w:val="1F4E47"/>
+          <w:color w:val="1B1F24"/>
           <w:sz w:val="22"/>
           <w:szCs w:val="22"/>
         </w:rPr>
@@ -2095,7 +2067,7 @@
           <w:rFonts w:ascii="Arial" w:cs="Arial" w:eastAsia="Arial" w:hAnsi="Arial"/>
           <w:b/>
           <w:bCs/>
-          <w:color w:val="1F4E47"/>
+          <w:color w:val="1B1F24"/>
           <w:sz w:val="22"/>
           <w:szCs w:val="22"/>
         </w:rPr>
@@ -2104,7 +2076,7 @@
       <w:r>
         <w:rPr>
           <w:rFonts w:ascii="Arial" w:cs="Arial" w:eastAsia="Arial" w:hAnsi="Arial"/>
-          <w:color w:val="1F4E47"/>
+          <w:color w:val="1B1F24"/>
           <w:sz w:val="22"/>
           <w:szCs w:val="22"/>
         </w:rPr>
@@ -2123,7 +2095,7 @@
       <w:r>
         <w:rPr>
           <w:rFonts w:ascii="Arial" w:cs="Arial" w:eastAsia="Arial" w:hAnsi="Arial"/>
-          <w:color w:val="1F4E47"/>
+          <w:color w:val="1B1F24"/>
           <w:sz w:val="22"/>
           <w:szCs w:val="22"/>
         </w:rPr>
@@ -2143,26 +2115,23 @@
       </w:pPr>
       <w:r>
         <w:rPr>
-          <w:rFonts w:ascii="Arial" w:cs="Arial" w:eastAsia="Arial" w:hAnsi="Arial"/>
-          <w:b/>
-          <w:bCs/>
-          <w:color w:val="F2B134"/>
-          <w:sz w:val="26"/>
-          <w:szCs w:val="26"/>
-          <w:shd w:fill="1F4E47" w:color="auto" w:val="clear"/>
-        </w:rPr>
-        <w:t xml:space="preserve"> 3.2 </w:t>
-      </w:r>
-      <w:r>
-        <w:rPr>
-          <w:rFonts w:ascii="Arial" w:cs="Arial" w:eastAsia="Arial" w:hAnsi="Arial"/>
-          <w:b/>
-          <w:bCs/>
-          <w:color w:val="1F4E47"/>
+          <w:rFonts w:ascii="Cambria" w:cs="Cambria" w:eastAsia="Cambria" w:hAnsi="Cambria"/>
+          <w:i/>
+          <w:iCs/>
+          <w:color w:val="A67C3D"/>
           <w:sz w:val="30"/>
           <w:szCs w:val="30"/>
         </w:rPr>
-        <w:t xml:space="preserve">  Quy tắc 3 màu đèn</w:t>
+        <w:t xml:space="preserve">3.2</w:t>
+      </w:r>
+      <w:r>
+        <w:rPr>
+          <w:rFonts w:ascii="Cambria" w:cs="Cambria" w:eastAsia="Cambria" w:hAnsi="Cambria"/>
+          <w:color w:val="1B1F24"/>
+          <w:sz w:val="32"/>
+          <w:szCs w:val="32"/>
+        </w:rPr>
+        <w:t xml:space="preserve">   Quy tắc 3 màu đèn</w:t>
       </w:r>
     </w:p>
     <w:p>
@@ -2221,7 +2190,7 @@
           <w:rFonts w:ascii="Arial" w:cs="Arial" w:eastAsia="Arial" w:hAnsi="Arial"/>
           <w:i/>
           <w:iCs/>
-          <w:color w:val="1F4E47"/>
+          <w:color w:val="1B1F24"/>
           <w:sz w:val="18"/>
           <w:szCs w:val="18"/>
         </w:rPr>
@@ -2236,26 +2205,23 @@
       </w:pPr>
       <w:r>
         <w:rPr>
-          <w:rFonts w:ascii="Arial" w:cs="Arial" w:eastAsia="Arial" w:hAnsi="Arial"/>
-          <w:b/>
-          <w:bCs/>
-          <w:color w:val="F2B134"/>
-          <w:sz w:val="26"/>
-          <w:szCs w:val="26"/>
-          <w:shd w:fill="1F4E47" w:color="auto" w:val="clear"/>
-        </w:rPr>
-        <w:t xml:space="preserve"> 3.3 </w:t>
-      </w:r>
-      <w:r>
-        <w:rPr>
-          <w:rFonts w:ascii="Arial" w:cs="Arial" w:eastAsia="Arial" w:hAnsi="Arial"/>
-          <w:b/>
-          <w:bCs/>
-          <w:color w:val="1F4E47"/>
+          <w:rFonts w:ascii="Cambria" w:cs="Cambria" w:eastAsia="Cambria" w:hAnsi="Cambria"/>
+          <w:i/>
+          <w:iCs/>
+          <w:color w:val="A67C3D"/>
           <w:sz w:val="30"/>
           <w:szCs w:val="30"/>
         </w:rPr>
-        <w:t xml:space="preserve">  Học sinh có được tự dùng AI không?</w:t>
+        <w:t xml:space="preserve">3.3</w:t>
+      </w:r>
+      <w:r>
+        <w:rPr>
+          <w:rFonts w:ascii="Cambria" w:cs="Cambria" w:eastAsia="Cambria" w:hAnsi="Cambria"/>
+          <w:color w:val="1B1F24"/>
+          <w:sz w:val="32"/>
+          <w:szCs w:val="32"/>
+        </w:rPr>
+        <w:t xml:space="preserve">   Học sinh có được tự dùng AI không?</w:t>
       </w:r>
     </w:p>
     <w:p>
@@ -2270,7 +2236,7 @@
       <w:r>
         <w:rPr>
           <w:rFonts w:ascii="Arial" w:cs="Arial" w:eastAsia="Arial" w:hAnsi="Arial"/>
-          <w:color w:val="1F4E47"/>
+          <w:color w:val="1B1F24"/>
           <w:sz w:val="22"/>
           <w:szCs w:val="22"/>
         </w:rPr>
@@ -2281,7 +2247,7 @@
           <w:rFonts w:ascii="Arial" w:cs="Arial" w:eastAsia="Arial" w:hAnsi="Arial"/>
           <w:b/>
           <w:bCs/>
-          <w:color w:val="1F4E47"/>
+          <w:color w:val="1B1F24"/>
           <w:sz w:val="22"/>
           <w:szCs w:val="22"/>
         </w:rPr>
@@ -2290,7 +2256,7 @@
       <w:r>
         <w:rPr>
           <w:rFonts w:ascii="Arial" w:cs="Arial" w:eastAsia="Arial" w:hAnsi="Arial"/>
-          <w:color w:val="1F4E47"/>
+          <w:color w:val="1B1F24"/>
           <w:sz w:val="22"/>
           <w:szCs w:val="22"/>
         </w:rPr>
@@ -2309,7 +2275,7 @@
       <w:r>
         <w:rPr>
           <w:rFonts w:ascii="Arial" w:cs="Arial" w:eastAsia="Arial" w:hAnsi="Arial"/>
-          <w:color w:val="1F4E47"/>
+          <w:color w:val="1B1F24"/>
           <w:sz w:val="22"/>
           <w:szCs w:val="22"/>
         </w:rPr>
@@ -2320,7 +2286,7 @@
           <w:rFonts w:ascii="Arial" w:cs="Arial" w:eastAsia="Arial" w:hAnsi="Arial"/>
           <w:b/>
           <w:bCs/>
-          <w:color w:val="1F4E47"/>
+          <w:color w:val="1B1F24"/>
           <w:sz w:val="22"/>
           <w:szCs w:val="22"/>
         </w:rPr>
@@ -2329,7 +2295,7 @@
       <w:r>
         <w:rPr>
           <w:rFonts w:ascii="Arial" w:cs="Arial" w:eastAsia="Arial" w:hAnsi="Arial"/>
-          <w:color w:val="1F4E47"/>
+          <w:color w:val="1B1F24"/>
           <w:sz w:val="22"/>
           <w:szCs w:val="22"/>
         </w:rPr>
@@ -2340,7 +2306,7 @@
           <w:rFonts w:ascii="Arial" w:cs="Arial" w:eastAsia="Arial" w:hAnsi="Arial"/>
           <w:b/>
           <w:bCs/>
-          <w:color w:val="1F4E47"/>
+          <w:color w:val="1B1F24"/>
           <w:sz w:val="22"/>
           <w:szCs w:val="22"/>
         </w:rPr>
@@ -2349,7 +2315,7 @@
       <w:r>
         <w:rPr>
           <w:rFonts w:ascii="Arial" w:cs="Arial" w:eastAsia="Arial" w:hAnsi="Arial"/>
-          <w:color w:val="1F4E47"/>
+          <w:color w:val="1B1F24"/>
           <w:sz w:val="22"/>
           <w:szCs w:val="22"/>
         </w:rPr>
@@ -2368,7 +2334,7 @@
       <w:r>
         <w:rPr>
           <w:rFonts w:ascii="Arial" w:cs="Arial" w:eastAsia="Arial" w:hAnsi="Arial"/>
-          <w:color w:val="1F4E47"/>
+          <w:color w:val="1B1F24"/>
           <w:sz w:val="22"/>
           <w:szCs w:val="22"/>
         </w:rPr>
@@ -2379,7 +2345,7 @@
           <w:rFonts w:ascii="Arial" w:cs="Arial" w:eastAsia="Arial" w:hAnsi="Arial"/>
           <w:b/>
           <w:bCs/>
-          <w:color w:val="1F4E47"/>
+          <w:color w:val="1B1F24"/>
           <w:sz w:val="22"/>
           <w:szCs w:val="22"/>
         </w:rPr>
@@ -2388,7 +2354,7 @@
       <w:r>
         <w:rPr>
           <w:rFonts w:ascii="Arial" w:cs="Arial" w:eastAsia="Arial" w:hAnsi="Arial"/>
-          <w:color w:val="1F4E47"/>
+          <w:color w:val="1B1F24"/>
           <w:sz w:val="22"/>
           <w:szCs w:val="22"/>
         </w:rPr>
@@ -2407,7 +2373,7 @@
       <w:r>
         <w:rPr>
           <w:rFonts w:ascii="Arial" w:cs="Arial" w:eastAsia="Arial" w:hAnsi="Arial"/>
-          <w:color w:val="1F4E47"/>
+          <w:color w:val="1B1F24"/>
           <w:sz w:val="22"/>
           <w:szCs w:val="22"/>
         </w:rPr>
@@ -2427,26 +2393,23 @@
       </w:pPr>
       <w:r>
         <w:rPr>
-          <w:rFonts w:ascii="Arial" w:cs="Arial" w:eastAsia="Arial" w:hAnsi="Arial"/>
-          <w:b/>
-          <w:bCs/>
-          <w:color w:val="F2B134"/>
-          <w:sz w:val="26"/>
-          <w:szCs w:val="26"/>
-          <w:shd w:fill="1F4E47" w:color="auto" w:val="clear"/>
-        </w:rPr>
-        <w:t xml:space="preserve"> 3.4 </w:t>
-      </w:r>
-      <w:r>
-        <w:rPr>
-          <w:rFonts w:ascii="Arial" w:cs="Arial" w:eastAsia="Arial" w:hAnsi="Arial"/>
-          <w:b/>
-          <w:bCs/>
-          <w:color w:val="1F4E47"/>
+          <w:rFonts w:ascii="Cambria" w:cs="Cambria" w:eastAsia="Cambria" w:hAnsi="Cambria"/>
+          <w:i/>
+          <w:iCs/>
+          <w:color w:val="A67C3D"/>
           <w:sz w:val="30"/>
           <w:szCs w:val="30"/>
         </w:rPr>
-        <w:t xml:space="preserve">  Minh bạch khi dùng AI</w:t>
+        <w:t xml:space="preserve">3.4</w:t>
+      </w:r>
+      <w:r>
+        <w:rPr>
+          <w:rFonts w:ascii="Cambria" w:cs="Cambria" w:eastAsia="Cambria" w:hAnsi="Cambria"/>
+          <w:color w:val="1B1F24"/>
+          <w:sz w:val="32"/>
+          <w:szCs w:val="32"/>
+        </w:rPr>
+        <w:t xml:space="preserve">   Minh bạch khi dùng AI</w:t>
       </w:r>
     </w:p>
     <w:p>
@@ -2456,7 +2419,7 @@
       <w:r>
         <w:rPr>
           <w:rFonts w:ascii="Arial" w:cs="Arial" w:eastAsia="Arial" w:hAnsi="Arial"/>
-          <w:color w:val="1F4E47"/>
+          <w:color w:val="1B1F24"/>
           <w:sz w:val="22"/>
           <w:szCs w:val="22"/>
         </w:rPr>
@@ -2470,14 +2433,12 @@
       <w:r>
         <w:rPr>
           <w:rFonts w:ascii="Arial" w:cs="Arial" w:eastAsia="Arial" w:hAnsi="Arial"/>
-          <w:b/>
-          <w:bCs/>
-          <w:color w:val="1F4E47"/>
-          <w:sz w:val="22"/>
-          <w:szCs w:val="22"/>
-          <w:shd w:fill="F2B134" w:color="auto" w:val="clear"/>
-        </w:rPr>
-        <w:t xml:space="preserve"> MỤC 4 </w:t>
+          <w:color w:val="A67C3D"/>
+          <w:spacing w:val="60"/>
+          <w:sz w:val="18"/>
+          <w:szCs w:val="18"/>
+        </w:rPr>
+        <w:t xml:space="preserve">MỤC 4</w:t>
       </w:r>
     </w:p>
     <w:p>
@@ -2487,12 +2448,10 @@
       </w:pPr>
       <w:r>
         <w:rPr>
-          <w:rFonts w:ascii="Arial" w:cs="Arial" w:eastAsia="Arial" w:hAnsi="Arial"/>
-          <w:b/>
-          <w:bCs/>
-          <w:color w:val="1F4E47"/>
-          <w:sz w:val="44"/>
-          <w:szCs w:val="44"/>
+          <w:rFonts w:ascii="Cambria" w:cs="Cambria" w:eastAsia="Cambria" w:hAnsi="Cambria"/>
+          <w:color w:val="1B1F24"/>
+          <w:sz w:val="48"/>
+          <w:szCs w:val="48"/>
         </w:rPr>
         <w:t xml:space="preserve">Lộ trình tự học 7 ngày</w:t>
       </w:r>
@@ -2506,7 +2465,7 @@
           <w:rFonts w:ascii="Arial" w:cs="Arial" w:eastAsia="Arial" w:hAnsi="Arial"/>
           <w:i/>
           <w:iCs/>
-          <w:color w:val="1F4E47"/>
+          <w:color w:val="1B1F24"/>
           <w:sz w:val="22"/>
           <w:szCs w:val="22"/>
         </w:rPr>
@@ -2543,7 +2502,7 @@
               <w:bottom w:val="none" w:color="FFFFFF" w:sz="0"/>
               <w:right w:val="none" w:color="FFFFFF" w:sz="0"/>
             </w:tcBorders>
-            <w:shd w:fill="1F4E47" w:color="auto" w:val="clear"/>
+            <w:shd w:fill="1B1F24" w:color="auto" w:val="clear"/>
             <w:tcMar>
               <w:top w:type="dxa" w:w="90"/>
               <w:left w:type="dxa" w:w="160"/>
@@ -2574,7 +2533,7 @@
               <w:bottom w:val="none" w:color="FFFFFF" w:sz="0"/>
               <w:right w:val="none" w:color="FFFFFF" w:sz="0"/>
             </w:tcBorders>
-            <w:shd w:fill="1F4E47" w:color="auto" w:val="clear"/>
+            <w:shd w:fill="1B1F24" w:color="auto" w:val="clear"/>
             <w:tcMar>
               <w:top w:type="dxa" w:w="90"/>
               <w:left w:type="dxa" w:w="160"/>
@@ -2605,7 +2564,7 @@
               <w:bottom w:val="none" w:color="FFFFFF" w:sz="0"/>
               <w:right w:val="none" w:color="FFFFFF" w:sz="0"/>
             </w:tcBorders>
-            <w:shd w:fill="1F4E47" w:color="auto" w:val="clear"/>
+            <w:shd w:fill="1B1F24" w:color="auto" w:val="clear"/>
             <w:tcMar>
               <w:top w:type="dxa" w:w="90"/>
               <w:left w:type="dxa" w:w="160"/>
@@ -2638,7 +2597,7 @@
               <w:bottom w:val="none" w:color="FFFFFF" w:sz="0"/>
               <w:right w:val="none" w:color="FFFFFF" w:sz="0"/>
             </w:tcBorders>
-            <w:shd w:fill="E9EFEE" w:color="auto" w:val="clear"/>
+            <w:shd w:fill="F7F5F0" w:color="auto" w:val="clear"/>
             <w:tcMar>
               <w:top w:type="dxa" w:w="90"/>
               <w:left w:type="dxa" w:w="160"/>
@@ -2652,7 +2611,7 @@
                 <w:rFonts w:ascii="Arial" w:cs="Arial" w:eastAsia="Arial" w:hAnsi="Arial"/>
                 <w:b/>
                 <w:bCs/>
-                <w:color w:val="1F4E47"/>
+                <w:color w:val="1B1F24"/>
                 <w:sz w:val="20"/>
                 <w:szCs w:val="20"/>
               </w:rPr>
@@ -2669,7 +2628,7 @@
               <w:bottom w:val="none" w:color="FFFFFF" w:sz="0"/>
               <w:right w:val="none" w:color="FFFFFF" w:sz="0"/>
             </w:tcBorders>
-            <w:shd w:fill="E9EFEE" w:color="auto" w:val="clear"/>
+            <w:shd w:fill="F7F5F0" w:color="auto" w:val="clear"/>
             <w:tcMar>
               <w:top w:type="dxa" w:w="90"/>
               <w:left w:type="dxa" w:w="160"/>
@@ -2683,7 +2642,7 @@
                 <w:rFonts w:ascii="Arial" w:cs="Arial" w:eastAsia="Arial" w:hAnsi="Arial"/>
                 <w:b w:val="false"/>
                 <w:bCs w:val="false"/>
-                <w:color w:val="1F4E47"/>
+                <w:color w:val="1B1F24"/>
                 <w:sz w:val="20"/>
                 <w:szCs w:val="20"/>
               </w:rPr>
@@ -2700,7 +2659,7 @@
               <w:bottom w:val="none" w:color="FFFFFF" w:sz="0"/>
               <w:right w:val="none" w:color="FFFFFF" w:sz="0"/>
             </w:tcBorders>
-            <w:shd w:fill="E9EFEE" w:color="auto" w:val="clear"/>
+            <w:shd w:fill="F7F5F0" w:color="auto" w:val="clear"/>
             <w:tcMar>
               <w:top w:type="dxa" w:w="90"/>
               <w:left w:type="dxa" w:w="160"/>
@@ -2714,7 +2673,7 @@
                 <w:rFonts w:ascii="Arial" w:cs="Arial" w:eastAsia="Arial" w:hAnsi="Arial"/>
                 <w:b w:val="false"/>
                 <w:bCs w:val="false"/>
-                <w:color w:val="1F4E47"/>
+                <w:color w:val="1B1F24"/>
                 <w:sz w:val="20"/>
                 <w:szCs w:val="20"/>
               </w:rPr>
@@ -2747,7 +2706,7 @@
                 <w:rFonts w:ascii="Arial" w:cs="Arial" w:eastAsia="Arial" w:hAnsi="Arial"/>
                 <w:b/>
                 <w:bCs/>
-                <w:color w:val="1F4E47"/>
+                <w:color w:val="1B1F24"/>
                 <w:sz w:val="20"/>
                 <w:szCs w:val="20"/>
               </w:rPr>
@@ -2778,7 +2737,7 @@
                 <w:rFonts w:ascii="Arial" w:cs="Arial" w:eastAsia="Arial" w:hAnsi="Arial"/>
                 <w:b w:val="false"/>
                 <w:bCs w:val="false"/>
-                <w:color w:val="1F4E47"/>
+                <w:color w:val="1B1F24"/>
                 <w:sz w:val="20"/>
                 <w:szCs w:val="20"/>
               </w:rPr>
@@ -2809,7 +2768,7 @@
                 <w:rFonts w:ascii="Arial" w:cs="Arial" w:eastAsia="Arial" w:hAnsi="Arial"/>
                 <w:b w:val="false"/>
                 <w:bCs w:val="false"/>
-                <w:color w:val="1F4E47"/>
+                <w:color w:val="1B1F24"/>
                 <w:sz w:val="20"/>
                 <w:szCs w:val="20"/>
               </w:rPr>
@@ -2828,7 +2787,7 @@
               <w:bottom w:val="none" w:color="FFFFFF" w:sz="0"/>
               <w:right w:val="none" w:color="FFFFFF" w:sz="0"/>
             </w:tcBorders>
-            <w:shd w:fill="E9EFEE" w:color="auto" w:val="clear"/>
+            <w:shd w:fill="F7F5F0" w:color="auto" w:val="clear"/>
             <w:tcMar>
               <w:top w:type="dxa" w:w="90"/>
               <w:left w:type="dxa" w:w="160"/>
@@ -2842,7 +2801,7 @@
                 <w:rFonts w:ascii="Arial" w:cs="Arial" w:eastAsia="Arial" w:hAnsi="Arial"/>
                 <w:b/>
                 <w:bCs/>
-                <w:color w:val="1F4E47"/>
+                <w:color w:val="1B1F24"/>
                 <w:sz w:val="20"/>
                 <w:szCs w:val="20"/>
               </w:rPr>
@@ -2859,7 +2818,7 @@
               <w:bottom w:val="none" w:color="FFFFFF" w:sz="0"/>
               <w:right w:val="none" w:color="FFFFFF" w:sz="0"/>
             </w:tcBorders>
-            <w:shd w:fill="E9EFEE" w:color="auto" w:val="clear"/>
+            <w:shd w:fill="F7F5F0" w:color="auto" w:val="clear"/>
             <w:tcMar>
               <w:top w:type="dxa" w:w="90"/>
               <w:left w:type="dxa" w:w="160"/>
@@ -2873,7 +2832,7 @@
                 <w:rFonts w:ascii="Arial" w:cs="Arial" w:eastAsia="Arial" w:hAnsi="Arial"/>
                 <w:b w:val="false"/>
                 <w:bCs w:val="false"/>
-                <w:color w:val="1F4E47"/>
+                <w:color w:val="1B1F24"/>
                 <w:sz w:val="20"/>
                 <w:szCs w:val="20"/>
               </w:rPr>
@@ -2890,7 +2849,7 @@
               <w:bottom w:val="none" w:color="FFFFFF" w:sz="0"/>
               <w:right w:val="none" w:color="FFFFFF" w:sz="0"/>
             </w:tcBorders>
-            <w:shd w:fill="E9EFEE" w:color="auto" w:val="clear"/>
+            <w:shd w:fill="F7F5F0" w:color="auto" w:val="clear"/>
             <w:tcMar>
               <w:top w:type="dxa" w:w="90"/>
               <w:left w:type="dxa" w:w="160"/>
@@ -2904,7 +2863,7 @@
                 <w:rFonts w:ascii="Arial" w:cs="Arial" w:eastAsia="Arial" w:hAnsi="Arial"/>
                 <w:b w:val="false"/>
                 <w:bCs w:val="false"/>
-                <w:color w:val="1F4E47"/>
+                <w:color w:val="1B1F24"/>
                 <w:sz w:val="20"/>
                 <w:szCs w:val="20"/>
               </w:rPr>
@@ -2937,7 +2896,7 @@
                 <w:rFonts w:ascii="Arial" w:cs="Arial" w:eastAsia="Arial" w:hAnsi="Arial"/>
                 <w:b/>
                 <w:bCs/>
-                <w:color w:val="1F4E47"/>
+                <w:color w:val="1B1F24"/>
                 <w:sz w:val="20"/>
                 <w:szCs w:val="20"/>
               </w:rPr>
@@ -2968,7 +2927,7 @@
                 <w:rFonts w:ascii="Arial" w:cs="Arial" w:eastAsia="Arial" w:hAnsi="Arial"/>
                 <w:b w:val="false"/>
                 <w:bCs w:val="false"/>
-                <w:color w:val="1F4E47"/>
+                <w:color w:val="1B1F24"/>
                 <w:sz w:val="20"/>
                 <w:szCs w:val="20"/>
               </w:rPr>
@@ -2999,7 +2958,7 @@
                 <w:rFonts w:ascii="Arial" w:cs="Arial" w:eastAsia="Arial" w:hAnsi="Arial"/>
                 <w:b w:val="false"/>
                 <w:bCs w:val="false"/>
-                <w:color w:val="1F4E47"/>
+                <w:color w:val="1B1F24"/>
                 <w:sz w:val="20"/>
                 <w:szCs w:val="20"/>
               </w:rPr>
@@ -3018,7 +2977,7 @@
               <w:bottom w:val="none" w:color="FFFFFF" w:sz="0"/>
               <w:right w:val="none" w:color="FFFFFF" w:sz="0"/>
             </w:tcBorders>
-            <w:shd w:fill="E9EFEE" w:color="auto" w:val="clear"/>
+            <w:shd w:fill="F7F5F0" w:color="auto" w:val="clear"/>
             <w:tcMar>
               <w:top w:type="dxa" w:w="90"/>
               <w:left w:type="dxa" w:w="160"/>
@@ -3032,7 +2991,7 @@
                 <w:rFonts w:ascii="Arial" w:cs="Arial" w:eastAsia="Arial" w:hAnsi="Arial"/>
                 <w:b/>
                 <w:bCs/>
-                <w:color w:val="1F4E47"/>
+                <w:color w:val="1B1F24"/>
                 <w:sz w:val="20"/>
                 <w:szCs w:val="20"/>
               </w:rPr>
@@ -3049,7 +3008,7 @@
               <w:bottom w:val="none" w:color="FFFFFF" w:sz="0"/>
               <w:right w:val="none" w:color="FFFFFF" w:sz="0"/>
             </w:tcBorders>
-            <w:shd w:fill="E9EFEE" w:color="auto" w:val="clear"/>
+            <w:shd w:fill="F7F5F0" w:color="auto" w:val="clear"/>
             <w:tcMar>
               <w:top w:type="dxa" w:w="90"/>
               <w:left w:type="dxa" w:w="160"/>
@@ -3063,7 +3022,7 @@
                 <w:rFonts w:ascii="Arial" w:cs="Arial" w:eastAsia="Arial" w:hAnsi="Arial"/>
                 <w:b w:val="false"/>
                 <w:bCs w:val="false"/>
-                <w:color w:val="1F4E47"/>
+                <w:color w:val="1B1F24"/>
                 <w:sz w:val="20"/>
                 <w:szCs w:val="20"/>
               </w:rPr>
@@ -3080,7 +3039,7 @@
               <w:bottom w:val="none" w:color="FFFFFF" w:sz="0"/>
               <w:right w:val="none" w:color="FFFFFF" w:sz="0"/>
             </w:tcBorders>
-            <w:shd w:fill="E9EFEE" w:color="auto" w:val="clear"/>
+            <w:shd w:fill="F7F5F0" w:color="auto" w:val="clear"/>
             <w:tcMar>
               <w:top w:type="dxa" w:w="90"/>
               <w:left w:type="dxa" w:w="160"/>
@@ -3094,7 +3053,7 @@
                 <w:rFonts w:ascii="Arial" w:cs="Arial" w:eastAsia="Arial" w:hAnsi="Arial"/>
                 <w:b w:val="false"/>
                 <w:bCs w:val="false"/>
-                <w:color w:val="1F4E47"/>
+                <w:color w:val="1B1F24"/>
                 <w:sz w:val="20"/>
                 <w:szCs w:val="20"/>
               </w:rPr>
@@ -3127,7 +3086,7 @@
                 <w:rFonts w:ascii="Arial" w:cs="Arial" w:eastAsia="Arial" w:hAnsi="Arial"/>
                 <w:b/>
                 <w:bCs/>
-                <w:color w:val="1F4E47"/>
+                <w:color w:val="1B1F24"/>
                 <w:sz w:val="20"/>
                 <w:szCs w:val="20"/>
               </w:rPr>
@@ -3158,7 +3117,7 @@
                 <w:rFonts w:ascii="Arial" w:cs="Arial" w:eastAsia="Arial" w:hAnsi="Arial"/>
                 <w:b w:val="false"/>
                 <w:bCs w:val="false"/>
-                <w:color w:val="1F4E47"/>
+                <w:color w:val="1B1F24"/>
                 <w:sz w:val="20"/>
                 <w:szCs w:val="20"/>
               </w:rPr>
@@ -3189,7 +3148,7 @@
                 <w:rFonts w:ascii="Arial" w:cs="Arial" w:eastAsia="Arial" w:hAnsi="Arial"/>
                 <w:b w:val="false"/>
                 <w:bCs w:val="false"/>
-                <w:color w:val="1F4E47"/>
+                <w:color w:val="1B1F24"/>
                 <w:sz w:val="20"/>
                 <w:szCs w:val="20"/>
               </w:rPr>
@@ -3208,7 +3167,7 @@
               <w:bottom w:val="none" w:color="FFFFFF" w:sz="0"/>
               <w:right w:val="none" w:color="FFFFFF" w:sz="0"/>
             </w:tcBorders>
-            <w:shd w:fill="E9EFEE" w:color="auto" w:val="clear"/>
+            <w:shd w:fill="F7F5F0" w:color="auto" w:val="clear"/>
             <w:tcMar>
               <w:top w:type="dxa" w:w="90"/>
               <w:left w:type="dxa" w:w="160"/>
@@ -3222,7 +3181,7 @@
                 <w:rFonts w:ascii="Arial" w:cs="Arial" w:eastAsia="Arial" w:hAnsi="Arial"/>
                 <w:b/>
                 <w:bCs/>
-                <w:color w:val="1F4E47"/>
+                <w:color w:val="1B1F24"/>
                 <w:sz w:val="20"/>
                 <w:szCs w:val="20"/>
               </w:rPr>
@@ -3239,7 +3198,7 @@
               <w:bottom w:val="none" w:color="FFFFFF" w:sz="0"/>
               <w:right w:val="none" w:color="FFFFFF" w:sz="0"/>
             </w:tcBorders>
-            <w:shd w:fill="E9EFEE" w:color="auto" w:val="clear"/>
+            <w:shd w:fill="F7F5F0" w:color="auto" w:val="clear"/>
             <w:tcMar>
               <w:top w:type="dxa" w:w="90"/>
               <w:left w:type="dxa" w:w="160"/>
@@ -3253,7 +3212,7 @@
                 <w:rFonts w:ascii="Arial" w:cs="Arial" w:eastAsia="Arial" w:hAnsi="Arial"/>
                 <w:b w:val="false"/>
                 <w:bCs w:val="false"/>
-                <w:color w:val="1F4E47"/>
+                <w:color w:val="1B1F24"/>
                 <w:sz w:val="20"/>
                 <w:szCs w:val="20"/>
               </w:rPr>
@@ -3270,7 +3229,7 @@
               <w:bottom w:val="none" w:color="FFFFFF" w:sz="0"/>
               <w:right w:val="none" w:color="FFFFFF" w:sz="0"/>
             </w:tcBorders>
-            <w:shd w:fill="E9EFEE" w:color="auto" w:val="clear"/>
+            <w:shd w:fill="F7F5F0" w:color="auto" w:val="clear"/>
             <w:tcMar>
               <w:top w:type="dxa" w:w="90"/>
               <w:left w:type="dxa" w:w="160"/>
@@ -3284,7 +3243,7 @@
                 <w:rFonts w:ascii="Arial" w:cs="Arial" w:eastAsia="Arial" w:hAnsi="Arial"/>
                 <w:b w:val="false"/>
                 <w:bCs w:val="false"/>
-                <w:color w:val="1F4E47"/>
+                <w:color w:val="1B1F24"/>
                 <w:sz w:val="20"/>
                 <w:szCs w:val="20"/>
               </w:rPr>
@@ -3309,7 +3268,7 @@
           <w:rFonts w:ascii="Arial" w:cs="Arial" w:eastAsia="Arial" w:hAnsi="Arial"/>
           <w:b/>
           <w:bCs/>
-          <w:color w:val="B07A12"/>
+          <w:color w:val="A67C3D"/>
           <w:sz w:val="20"/>
           <w:szCs w:val="20"/>
         </w:rPr>
@@ -3318,7 +3277,7 @@
       <w:r>
         <w:rPr>
           <w:rFonts w:ascii="Arial" w:cs="Arial" w:eastAsia="Arial" w:hAnsi="Arial"/>
-          <w:color w:val="1F4E47"/>
+          <w:color w:val="1B1F24"/>
           <w:sz w:val="21"/>
           <w:szCs w:val="21"/>
         </w:rPr>
@@ -3332,14 +3291,12 @@
       <w:r>
         <w:rPr>
           <w:rFonts w:ascii="Arial" w:cs="Arial" w:eastAsia="Arial" w:hAnsi="Arial"/>
-          <w:b/>
-          <w:bCs/>
-          <w:color w:val="1F4E47"/>
-          <w:sz w:val="22"/>
-          <w:szCs w:val="22"/>
-          <w:shd w:fill="F2B134" w:color="auto" w:val="clear"/>
-        </w:rPr>
-        <w:t xml:space="preserve"> MỤC 5 </w:t>
+          <w:color w:val="A67C3D"/>
+          <w:spacing w:val="60"/>
+          <w:sz w:val="18"/>
+          <w:szCs w:val="18"/>
+        </w:rPr>
+        <w:t xml:space="preserve">MỤC 5</w:t>
       </w:r>
     </w:p>
     <w:p>
@@ -3349,12 +3306,10 @@
       </w:pPr>
       <w:r>
         <w:rPr>
-          <w:rFonts w:ascii="Arial" w:cs="Arial" w:eastAsia="Arial" w:hAnsi="Arial"/>
-          <w:b/>
-          <w:bCs/>
-          <w:color w:val="1F4E47"/>
-          <w:sz w:val="44"/>
-          <w:szCs w:val="44"/>
+          <w:rFonts w:ascii="Cambria" w:cs="Cambria" w:eastAsia="Cambria" w:hAnsi="Cambria"/>
+          <w:color w:val="1B1F24"/>
+          <w:sz w:val="48"/>
+          <w:szCs w:val="48"/>
         </w:rPr>
         <w:t xml:space="preserve">10 quy tắc vàng khi viết câu lệnh</w:t>
       </w:r>
@@ -3368,7 +3323,7 @@
           <w:rFonts w:ascii="Arial" w:cs="Arial" w:eastAsia="Arial" w:hAnsi="Arial"/>
           <w:i/>
           <w:iCs/>
-          <w:color w:val="1F4E47"/>
+          <w:color w:val="1B1F24"/>
           <w:sz w:val="22"/>
           <w:szCs w:val="22"/>
         </w:rPr>
@@ -3389,7 +3344,7 @@
           <w:rFonts w:ascii="Arial" w:cs="Arial" w:eastAsia="Arial" w:hAnsi="Arial"/>
           <w:b/>
           <w:bCs/>
-          <w:color w:val="1F4E47"/>
+          <w:color w:val="1B1F24"/>
           <w:sz w:val="22"/>
           <w:szCs w:val="22"/>
         </w:rPr>
@@ -3398,7 +3353,7 @@
       <w:r>
         <w:rPr>
           <w:rFonts w:ascii="Arial" w:cs="Arial" w:eastAsia="Arial" w:hAnsi="Arial"/>
-          <w:color w:val="1F4E47"/>
+          <w:color w:val="1B1F24"/>
           <w:sz w:val="22"/>
           <w:szCs w:val="22"/>
         </w:rPr>
@@ -3419,7 +3374,7 @@
           <w:rFonts w:ascii="Arial" w:cs="Arial" w:eastAsia="Arial" w:hAnsi="Arial"/>
           <w:b/>
           <w:bCs/>
-          <w:color w:val="1F4E47"/>
+          <w:color w:val="1B1F24"/>
           <w:sz w:val="22"/>
           <w:szCs w:val="22"/>
         </w:rPr>
@@ -3428,7 +3383,7 @@
       <w:r>
         <w:rPr>
           <w:rFonts w:ascii="Arial" w:cs="Arial" w:eastAsia="Arial" w:hAnsi="Arial"/>
-          <w:color w:val="1F4E47"/>
+          <w:color w:val="1B1F24"/>
           <w:sz w:val="22"/>
           <w:szCs w:val="22"/>
         </w:rPr>
@@ -3449,7 +3404,7 @@
           <w:rFonts w:ascii="Arial" w:cs="Arial" w:eastAsia="Arial" w:hAnsi="Arial"/>
           <w:b/>
           <w:bCs/>
-          <w:color w:val="1F4E47"/>
+          <w:color w:val="1B1F24"/>
           <w:sz w:val="22"/>
           <w:szCs w:val="22"/>
         </w:rPr>
@@ -3458,7 +3413,7 @@
       <w:r>
         <w:rPr>
           <w:rFonts w:ascii="Arial" w:cs="Arial" w:eastAsia="Arial" w:hAnsi="Arial"/>
-          <w:color w:val="1F4E47"/>
+          <w:color w:val="1B1F24"/>
           <w:sz w:val="22"/>
           <w:szCs w:val="22"/>
         </w:rPr>
@@ -3479,7 +3434,7 @@
           <w:rFonts w:ascii="Arial" w:cs="Arial" w:eastAsia="Arial" w:hAnsi="Arial"/>
           <w:b/>
           <w:bCs/>
-          <w:color w:val="1F4E47"/>
+          <w:color w:val="1B1F24"/>
           <w:sz w:val="22"/>
           <w:szCs w:val="22"/>
         </w:rPr>
@@ -3488,7 +3443,7 @@
       <w:r>
         <w:rPr>
           <w:rFonts w:ascii="Arial" w:cs="Arial" w:eastAsia="Arial" w:hAnsi="Arial"/>
-          <w:color w:val="1F4E47"/>
+          <w:color w:val="1B1F24"/>
           <w:sz w:val="22"/>
           <w:szCs w:val="22"/>
         </w:rPr>
@@ -3509,7 +3464,7 @@
           <w:rFonts w:ascii="Arial" w:cs="Arial" w:eastAsia="Arial" w:hAnsi="Arial"/>
           <w:b/>
           <w:bCs/>
-          <w:color w:val="1F4E47"/>
+          <w:color w:val="1B1F24"/>
           <w:sz w:val="22"/>
           <w:szCs w:val="22"/>
         </w:rPr>
@@ -3518,7 +3473,7 @@
       <w:r>
         <w:rPr>
           <w:rFonts w:ascii="Arial" w:cs="Arial" w:eastAsia="Arial" w:hAnsi="Arial"/>
-          <w:color w:val="1F4E47"/>
+          <w:color w:val="1B1F24"/>
           <w:sz w:val="22"/>
           <w:szCs w:val="22"/>
         </w:rPr>
@@ -3539,7 +3494,7 @@
           <w:rFonts w:ascii="Arial" w:cs="Arial" w:eastAsia="Arial" w:hAnsi="Arial"/>
           <w:b/>
           <w:bCs/>
-          <w:color w:val="1F4E47"/>
+          <w:color w:val="1B1F24"/>
           <w:sz w:val="22"/>
           <w:szCs w:val="22"/>
         </w:rPr>
@@ -3548,7 +3503,7 @@
       <w:r>
         <w:rPr>
           <w:rFonts w:ascii="Arial" w:cs="Arial" w:eastAsia="Arial" w:hAnsi="Arial"/>
-          <w:color w:val="1F4E47"/>
+          <w:color w:val="1B1F24"/>
           <w:sz w:val="22"/>
           <w:szCs w:val="22"/>
         </w:rPr>
@@ -3569,7 +3524,7 @@
           <w:rFonts w:ascii="Arial" w:cs="Arial" w:eastAsia="Arial" w:hAnsi="Arial"/>
           <w:b/>
           <w:bCs/>
-          <w:color w:val="1F4E47"/>
+          <w:color w:val="1B1F24"/>
           <w:sz w:val="22"/>
           <w:szCs w:val="22"/>
         </w:rPr>
@@ -3578,7 +3533,7 @@
       <w:r>
         <w:rPr>
           <w:rFonts w:ascii="Arial" w:cs="Arial" w:eastAsia="Arial" w:hAnsi="Arial"/>
-          <w:color w:val="1F4E47"/>
+          <w:color w:val="1B1F24"/>
           <w:sz w:val="22"/>
           <w:szCs w:val="22"/>
         </w:rPr>
@@ -3599,7 +3554,7 @@
           <w:rFonts w:ascii="Arial" w:cs="Arial" w:eastAsia="Arial" w:hAnsi="Arial"/>
           <w:b/>
           <w:bCs/>
-          <w:color w:val="1F4E47"/>
+          <w:color w:val="1B1F24"/>
           <w:sz w:val="22"/>
           <w:szCs w:val="22"/>
         </w:rPr>
@@ -3608,7 +3563,7 @@
       <w:r>
         <w:rPr>
           <w:rFonts w:ascii="Arial" w:cs="Arial" w:eastAsia="Arial" w:hAnsi="Arial"/>
-          <w:color w:val="1F4E47"/>
+          <w:color w:val="1B1F24"/>
           <w:sz w:val="22"/>
           <w:szCs w:val="22"/>
         </w:rPr>
@@ -3629,7 +3584,7 @@
           <w:rFonts w:ascii="Arial" w:cs="Arial" w:eastAsia="Arial" w:hAnsi="Arial"/>
           <w:b/>
           <w:bCs/>
-          <w:color w:val="1F4E47"/>
+          <w:color w:val="1B1F24"/>
           <w:sz w:val="22"/>
           <w:szCs w:val="22"/>
         </w:rPr>
@@ -3638,7 +3593,7 @@
       <w:r>
         <w:rPr>
           <w:rFonts w:ascii="Arial" w:cs="Arial" w:eastAsia="Arial" w:hAnsi="Arial"/>
-          <w:color w:val="1F4E47"/>
+          <w:color w:val="1B1F24"/>
           <w:sz w:val="22"/>
           <w:szCs w:val="22"/>
         </w:rPr>
@@ -3659,7 +3614,7 @@
           <w:rFonts w:ascii="Arial" w:cs="Arial" w:eastAsia="Arial" w:hAnsi="Arial"/>
           <w:b/>
           <w:bCs/>
-          <w:color w:val="1F4E47"/>
+          <w:color w:val="1B1F24"/>
           <w:sz w:val="22"/>
           <w:szCs w:val="22"/>
         </w:rPr>
@@ -3668,7 +3623,7 @@
       <w:r>
         <w:rPr>
           <w:rFonts w:ascii="Arial" w:cs="Arial" w:eastAsia="Arial" w:hAnsi="Arial"/>
-          <w:color w:val="1F4E47"/>
+          <w:color w:val="1B1F24"/>
           <w:sz w:val="22"/>
           <w:szCs w:val="22"/>
         </w:rPr>
@@ -3687,14 +3642,12 @@
       <w:r>
         <w:rPr>
           <w:rFonts w:ascii="Arial" w:cs="Arial" w:eastAsia="Arial" w:hAnsi="Arial"/>
-          <w:b/>
-          <w:bCs/>
-          <w:color w:val="1F4E47"/>
-          <w:sz w:val="22"/>
-          <w:szCs w:val="22"/>
-          <w:shd w:fill="F2B134" w:color="auto" w:val="clear"/>
-        </w:rPr>
-        <w:t xml:space="preserve"> MỤC 6 </w:t>
+          <w:color w:val="A67C3D"/>
+          <w:spacing w:val="60"/>
+          <w:sz w:val="18"/>
+          <w:szCs w:val="18"/>
+        </w:rPr>
+        <w:t xml:space="preserve">MỤC 6</w:t>
       </w:r>
     </w:p>
     <w:p>
@@ -3704,12 +3657,10 @@
       </w:pPr>
       <w:r>
         <w:rPr>
-          <w:rFonts w:ascii="Arial" w:cs="Arial" w:eastAsia="Arial" w:hAnsi="Arial"/>
-          <w:b/>
-          <w:bCs/>
-          <w:color w:val="1F4E47"/>
-          <w:sz w:val="44"/>
-          <w:szCs w:val="44"/>
+          <w:rFonts w:ascii="Cambria" w:cs="Cambria" w:eastAsia="Cambria" w:hAnsi="Cambria"/>
+          <w:color w:val="1B1F24"/>
+          <w:sz w:val="48"/>
+          <w:szCs w:val="48"/>
         </w:rPr>
         <w:t xml:space="preserve">Xử lý sự cố thường gặp</w:t>
       </w:r>
@@ -3723,7 +3674,7 @@
           <w:rFonts w:ascii="Arial" w:cs="Arial" w:eastAsia="Arial" w:hAnsi="Arial"/>
           <w:i/>
           <w:iCs/>
-          <w:color w:val="1F4E47"/>
+          <w:color w:val="1B1F24"/>
           <w:sz w:val="22"/>
           <w:szCs w:val="22"/>
         </w:rPr>
@@ -3759,7 +3710,7 @@
               <w:bottom w:val="none" w:color="FFFFFF" w:sz="0"/>
               <w:right w:val="none" w:color="FFFFFF" w:sz="0"/>
             </w:tcBorders>
-            <w:shd w:fill="1F4E47" w:color="auto" w:val="clear"/>
+            <w:shd w:fill="1B1F24" w:color="auto" w:val="clear"/>
             <w:tcMar>
               <w:top w:type="dxa" w:w="90"/>
               <w:left w:type="dxa" w:w="160"/>
@@ -3790,7 +3741,7 @@
               <w:bottom w:val="none" w:color="FFFFFF" w:sz="0"/>
               <w:right w:val="none" w:color="FFFFFF" w:sz="0"/>
             </w:tcBorders>
-            <w:shd w:fill="1F4E47" w:color="auto" w:val="clear"/>
+            <w:shd w:fill="1B1F24" w:color="auto" w:val="clear"/>
             <w:tcMar>
               <w:top w:type="dxa" w:w="90"/>
               <w:left w:type="dxa" w:w="160"/>
@@ -3823,7 +3774,7 @@
               <w:bottom w:val="none" w:color="FFFFFF" w:sz="0"/>
               <w:right w:val="none" w:color="FFFFFF" w:sz="0"/>
             </w:tcBorders>
-            <w:shd w:fill="E9EFEE" w:color="auto" w:val="clear"/>
+            <w:shd w:fill="F7F5F0" w:color="auto" w:val="clear"/>
             <w:tcMar>
               <w:top w:type="dxa" w:w="90"/>
               <w:left w:type="dxa" w:w="160"/>
@@ -3837,7 +3788,7 @@
                 <w:rFonts w:ascii="Arial" w:cs="Arial" w:eastAsia="Arial" w:hAnsi="Arial"/>
                 <w:b/>
                 <w:bCs/>
-                <w:color w:val="1F4E47"/>
+                <w:color w:val="1B1F24"/>
                 <w:sz w:val="20"/>
                 <w:szCs w:val="20"/>
               </w:rPr>
@@ -3854,7 +3805,7 @@
               <w:bottom w:val="none" w:color="FFFFFF" w:sz="0"/>
               <w:right w:val="none" w:color="FFFFFF" w:sz="0"/>
             </w:tcBorders>
-            <w:shd w:fill="E9EFEE" w:color="auto" w:val="clear"/>
+            <w:shd w:fill="F7F5F0" w:color="auto" w:val="clear"/>
             <w:tcMar>
               <w:top w:type="dxa" w:w="90"/>
               <w:left w:type="dxa" w:w="160"/>
@@ -3868,7 +3819,7 @@
                 <w:rFonts w:ascii="Arial" w:cs="Arial" w:eastAsia="Arial" w:hAnsi="Arial"/>
                 <w:b w:val="false"/>
                 <w:bCs w:val="false"/>
-                <w:color w:val="1F4E47"/>
+                <w:color w:val="1B1F24"/>
                 <w:sz w:val="20"/>
                 <w:szCs w:val="20"/>
               </w:rPr>
@@ -3901,7 +3852,7 @@
                 <w:rFonts w:ascii="Arial" w:cs="Arial" w:eastAsia="Arial" w:hAnsi="Arial"/>
                 <w:b/>
                 <w:bCs/>
-                <w:color w:val="1F4E47"/>
+                <w:color w:val="1B1F24"/>
                 <w:sz w:val="20"/>
                 <w:szCs w:val="20"/>
               </w:rPr>
@@ -3932,7 +3883,7 @@
                 <w:rFonts w:ascii="Arial" w:cs="Arial" w:eastAsia="Arial" w:hAnsi="Arial"/>
                 <w:b w:val="false"/>
                 <w:bCs w:val="false"/>
-                <w:color w:val="1F4E47"/>
+                <w:color w:val="1B1F24"/>
                 <w:sz w:val="20"/>
                 <w:szCs w:val="20"/>
               </w:rPr>
@@ -3951,7 +3902,7 @@
               <w:bottom w:val="none" w:color="FFFFFF" w:sz="0"/>
               <w:right w:val="none" w:color="FFFFFF" w:sz="0"/>
             </w:tcBorders>
-            <w:shd w:fill="E9EFEE" w:color="auto" w:val="clear"/>
+            <w:shd w:fill="F7F5F0" w:color="auto" w:val="clear"/>
             <w:tcMar>
               <w:top w:type="dxa" w:w="90"/>
               <w:left w:type="dxa" w:w="160"/>
@@ -3965,7 +3916,7 @@
                 <w:rFonts w:ascii="Arial" w:cs="Arial" w:eastAsia="Arial" w:hAnsi="Arial"/>
                 <w:b/>
                 <w:bCs/>
-                <w:color w:val="1F4E47"/>
+                <w:color w:val="1B1F24"/>
                 <w:sz w:val="20"/>
                 <w:szCs w:val="20"/>
               </w:rPr>
@@ -3982,7 +3933,7 @@
               <w:bottom w:val="none" w:color="FFFFFF" w:sz="0"/>
               <w:right w:val="none" w:color="FFFFFF" w:sz="0"/>
             </w:tcBorders>
-            <w:shd w:fill="E9EFEE" w:color="auto" w:val="clear"/>
+            <w:shd w:fill="F7F5F0" w:color="auto" w:val="clear"/>
             <w:tcMar>
               <w:top w:type="dxa" w:w="90"/>
               <w:left w:type="dxa" w:w="160"/>
@@ -3996,7 +3947,7 @@
                 <w:rFonts w:ascii="Arial" w:cs="Arial" w:eastAsia="Arial" w:hAnsi="Arial"/>
                 <w:b w:val="false"/>
                 <w:bCs w:val="false"/>
-                <w:color w:val="1F4E47"/>
+                <w:color w:val="1B1F24"/>
                 <w:sz w:val="20"/>
                 <w:szCs w:val="20"/>
               </w:rPr>
@@ -4029,7 +3980,7 @@
                 <w:rFonts w:ascii="Arial" w:cs="Arial" w:eastAsia="Arial" w:hAnsi="Arial"/>
                 <w:b/>
                 <w:bCs/>
-                <w:color w:val="1F4E47"/>
+                <w:color w:val="1B1F24"/>
                 <w:sz w:val="20"/>
                 <w:szCs w:val="20"/>
               </w:rPr>
@@ -4060,7 +4011,7 @@
                 <w:rFonts w:ascii="Arial" w:cs="Arial" w:eastAsia="Arial" w:hAnsi="Arial"/>
                 <w:b w:val="false"/>
                 <w:bCs w:val="false"/>
-                <w:color w:val="1F4E47"/>
+                <w:color w:val="1B1F24"/>
                 <w:sz w:val="20"/>
                 <w:szCs w:val="20"/>
               </w:rPr>
@@ -4079,7 +4030,7 @@
               <w:bottom w:val="none" w:color="FFFFFF" w:sz="0"/>
               <w:right w:val="none" w:color="FFFFFF" w:sz="0"/>
             </w:tcBorders>
-            <w:shd w:fill="E9EFEE" w:color="auto" w:val="clear"/>
+            <w:shd w:fill="F7F5F0" w:color="auto" w:val="clear"/>
             <w:tcMar>
               <w:top w:type="dxa" w:w="90"/>
               <w:left w:type="dxa" w:w="160"/>
@@ -4093,7 +4044,7 @@
                 <w:rFonts w:ascii="Arial" w:cs="Arial" w:eastAsia="Arial" w:hAnsi="Arial"/>
                 <w:b/>
                 <w:bCs/>
-                <w:color w:val="1F4E47"/>
+                <w:color w:val="1B1F24"/>
                 <w:sz w:val="20"/>
                 <w:szCs w:val="20"/>
               </w:rPr>
@@ -4110,7 +4061,7 @@
               <w:bottom w:val="none" w:color="FFFFFF" w:sz="0"/>
               <w:right w:val="none" w:color="FFFFFF" w:sz="0"/>
             </w:tcBorders>
-            <w:shd w:fill="E9EFEE" w:color="auto" w:val="clear"/>
+            <w:shd w:fill="F7F5F0" w:color="auto" w:val="clear"/>
             <w:tcMar>
               <w:top w:type="dxa" w:w="90"/>
               <w:left w:type="dxa" w:w="160"/>
@@ -4124,7 +4075,7 @@
                 <w:rFonts w:ascii="Arial" w:cs="Arial" w:eastAsia="Arial" w:hAnsi="Arial"/>
                 <w:b w:val="false"/>
                 <w:bCs w:val="false"/>
-                <w:color w:val="1F4E47"/>
+                <w:color w:val="1B1F24"/>
                 <w:sz w:val="20"/>
                 <w:szCs w:val="20"/>
               </w:rPr>
@@ -4157,7 +4108,7 @@
                 <w:rFonts w:ascii="Arial" w:cs="Arial" w:eastAsia="Arial" w:hAnsi="Arial"/>
                 <w:b/>
                 <w:bCs/>
-                <w:color w:val="1F4E47"/>
+                <w:color w:val="1B1F24"/>
                 <w:sz w:val="20"/>
                 <w:szCs w:val="20"/>
               </w:rPr>
@@ -4188,7 +4139,7 @@
                 <w:rFonts w:ascii="Arial" w:cs="Arial" w:eastAsia="Arial" w:hAnsi="Arial"/>
                 <w:b w:val="false"/>
                 <w:bCs w:val="false"/>
-                <w:color w:val="1F4E47"/>
+                <w:color w:val="1B1F24"/>
                 <w:sz w:val="20"/>
                 <w:szCs w:val="20"/>
               </w:rPr>
@@ -4207,7 +4158,7 @@
               <w:bottom w:val="none" w:color="FFFFFF" w:sz="0"/>
               <w:right w:val="none" w:color="FFFFFF" w:sz="0"/>
             </w:tcBorders>
-            <w:shd w:fill="E9EFEE" w:color="auto" w:val="clear"/>
+            <w:shd w:fill="F7F5F0" w:color="auto" w:val="clear"/>
             <w:tcMar>
               <w:top w:type="dxa" w:w="90"/>
               <w:left w:type="dxa" w:w="160"/>
@@ -4221,7 +4172,7 @@
                 <w:rFonts w:ascii="Arial" w:cs="Arial" w:eastAsia="Arial" w:hAnsi="Arial"/>
                 <w:b/>
                 <w:bCs/>
-                <w:color w:val="1F4E47"/>
+                <w:color w:val="1B1F24"/>
                 <w:sz w:val="20"/>
                 <w:szCs w:val="20"/>
               </w:rPr>
@@ -4238,7 +4189,7 @@
               <w:bottom w:val="none" w:color="FFFFFF" w:sz="0"/>
               <w:right w:val="none" w:color="FFFFFF" w:sz="0"/>
             </w:tcBorders>
-            <w:shd w:fill="E9EFEE" w:color="auto" w:val="clear"/>
+            <w:shd w:fill="F7F5F0" w:color="auto" w:val="clear"/>
             <w:tcMar>
               <w:top w:type="dxa" w:w="90"/>
               <w:left w:type="dxa" w:w="160"/>
@@ -4252,7 +4203,7 @@
                 <w:rFonts w:ascii="Arial" w:cs="Arial" w:eastAsia="Arial" w:hAnsi="Arial"/>
                 <w:b w:val="false"/>
                 <w:bCs w:val="false"/>
-                <w:color w:val="1F4E47"/>
+                <w:color w:val="1B1F24"/>
                 <w:sz w:val="20"/>
                 <w:szCs w:val="20"/>
               </w:rPr>
@@ -4285,7 +4236,7 @@
                 <w:rFonts w:ascii="Arial" w:cs="Arial" w:eastAsia="Arial" w:hAnsi="Arial"/>
                 <w:b/>
                 <w:bCs/>
-                <w:color w:val="1F4E47"/>
+                <w:color w:val="1B1F24"/>
                 <w:sz w:val="20"/>
                 <w:szCs w:val="20"/>
               </w:rPr>
@@ -4316,7 +4267,7 @@
                 <w:rFonts w:ascii="Arial" w:cs="Arial" w:eastAsia="Arial" w:hAnsi="Arial"/>
                 <w:b w:val="false"/>
                 <w:bCs w:val="false"/>
-                <w:color w:val="1F4E47"/>
+                <w:color w:val="1B1F24"/>
                 <w:sz w:val="20"/>
                 <w:szCs w:val="20"/>
               </w:rPr>
@@ -4335,7 +4286,7 @@
               <w:bottom w:val="none" w:color="FFFFFF" w:sz="0"/>
               <w:right w:val="none" w:color="FFFFFF" w:sz="0"/>
             </w:tcBorders>
-            <w:shd w:fill="E9EFEE" w:color="auto" w:val="clear"/>
+            <w:shd w:fill="F7F5F0" w:color="auto" w:val="clear"/>
             <w:tcMar>
               <w:top w:type="dxa" w:w="90"/>
               <w:left w:type="dxa" w:w="160"/>
@@ -4349,7 +4300,7 @@
                 <w:rFonts w:ascii="Arial" w:cs="Arial" w:eastAsia="Arial" w:hAnsi="Arial"/>
                 <w:b/>
                 <w:bCs/>
-                <w:color w:val="1F4E47"/>
+                <w:color w:val="1B1F24"/>
                 <w:sz w:val="20"/>
                 <w:szCs w:val="20"/>
               </w:rPr>
@@ -4366,7 +4317,7 @@
               <w:bottom w:val="none" w:color="FFFFFF" w:sz="0"/>
               <w:right w:val="none" w:color="FFFFFF" w:sz="0"/>
             </w:tcBorders>
-            <w:shd w:fill="E9EFEE" w:color="auto" w:val="clear"/>
+            <w:shd w:fill="F7F5F0" w:color="auto" w:val="clear"/>
             <w:tcMar>
               <w:top w:type="dxa" w:w="90"/>
               <w:left w:type="dxa" w:w="160"/>
@@ -4380,7 +4331,7 @@
                 <w:rFonts w:ascii="Arial" w:cs="Arial" w:eastAsia="Arial" w:hAnsi="Arial"/>
                 <w:b w:val="false"/>
                 <w:bCs w:val="false"/>
-                <w:color w:val="1F4E47"/>
+                <w:color w:val="1B1F24"/>
                 <w:sz w:val="20"/>
                 <w:szCs w:val="20"/>
               </w:rPr>
@@ -4413,7 +4364,7 @@
                 <w:rFonts w:ascii="Arial" w:cs="Arial" w:eastAsia="Arial" w:hAnsi="Arial"/>
                 <w:b/>
                 <w:bCs/>
-                <w:color w:val="1F4E47"/>
+                <w:color w:val="1B1F24"/>
                 <w:sz w:val="20"/>
                 <w:szCs w:val="20"/>
               </w:rPr>
@@ -4444,7 +4395,7 @@
                 <w:rFonts w:ascii="Arial" w:cs="Arial" w:eastAsia="Arial" w:hAnsi="Arial"/>
                 <w:b w:val="false"/>
                 <w:bCs w:val="false"/>
-                <w:color w:val="1F4E47"/>
+                <w:color w:val="1B1F24"/>
                 <w:sz w:val="20"/>
                 <w:szCs w:val="20"/>
               </w:rPr>
@@ -4466,14 +4417,12 @@
       <w:r>
         <w:rPr>
           <w:rFonts w:ascii="Arial" w:cs="Arial" w:eastAsia="Arial" w:hAnsi="Arial"/>
-          <w:b/>
-          <w:bCs/>
-          <w:color w:val="1F4E47"/>
-          <w:sz w:val="22"/>
-          <w:szCs w:val="22"/>
-          <w:shd w:fill="F2B134" w:color="auto" w:val="clear"/>
-        </w:rPr>
-        <w:t xml:space="preserve"> MỤC 7 </w:t>
+          <w:color w:val="A67C3D"/>
+          <w:spacing w:val="60"/>
+          <w:sz w:val="18"/>
+          <w:szCs w:val="18"/>
+        </w:rPr>
+        <w:t xml:space="preserve">MỤC 7</w:t>
       </w:r>
     </w:p>
     <w:p>
@@ -4483,12 +4432,10 @@
       </w:pPr>
       <w:r>
         <w:rPr>
-          <w:rFonts w:ascii="Arial" w:cs="Arial" w:eastAsia="Arial" w:hAnsi="Arial"/>
-          <w:b/>
-          <w:bCs/>
-          <w:color w:val="1F4E47"/>
-          <w:sz w:val="44"/>
-          <w:szCs w:val="44"/>
+          <w:rFonts w:ascii="Cambria" w:cs="Cambria" w:eastAsia="Cambria" w:hAnsi="Cambria"/>
+          <w:color w:val="1B1F24"/>
+          <w:sz w:val="48"/>
+          <w:szCs w:val="48"/>
         </w:rPr>
         <w:t xml:space="preserve">Nếu dùng bộ tài liệu để tập huấn cho đồng nghiệp</w:t>
       </w:r>
@@ -4502,7 +4449,7 @@
           <w:rFonts w:ascii="Arial" w:cs="Arial" w:eastAsia="Arial" w:hAnsi="Arial"/>
           <w:i/>
           <w:iCs/>
-          <w:color w:val="1F4E47"/>
+          <w:color w:val="1B1F24"/>
           <w:sz w:val="22"/>
           <w:szCs w:val="22"/>
         </w:rPr>
@@ -4539,7 +4486,7 @@
               <w:bottom w:val="none" w:color="FFFFFF" w:sz="0"/>
               <w:right w:val="none" w:color="FFFFFF" w:sz="0"/>
             </w:tcBorders>
-            <w:shd w:fill="1F4E47" w:color="auto" w:val="clear"/>
+            <w:shd w:fill="1B1F24" w:color="auto" w:val="clear"/>
             <w:tcMar>
               <w:top w:type="dxa" w:w="90"/>
               <w:left w:type="dxa" w:w="160"/>
@@ -4570,7 +4517,7 @@
               <w:bottom w:val="none" w:color="FFFFFF" w:sz="0"/>
               <w:right w:val="none" w:color="FFFFFF" w:sz="0"/>
             </w:tcBorders>
-            <w:shd w:fill="1F4E47" w:color="auto" w:val="clear"/>
+            <w:shd w:fill="1B1F24" w:color="auto" w:val="clear"/>
             <w:tcMar>
               <w:top w:type="dxa" w:w="90"/>
               <w:left w:type="dxa" w:w="160"/>
@@ -4601,7 +4548,7 @@
               <w:bottom w:val="none" w:color="FFFFFF" w:sz="0"/>
               <w:right w:val="none" w:color="FFFFFF" w:sz="0"/>
             </w:tcBorders>
-            <w:shd w:fill="1F4E47" w:color="auto" w:val="clear"/>
+            <w:shd w:fill="1B1F24" w:color="auto" w:val="clear"/>
             <w:tcMar>
               <w:top w:type="dxa" w:w="90"/>
               <w:left w:type="dxa" w:w="160"/>
@@ -4634,7 +4581,7 @@
               <w:bottom w:val="none" w:color="FFFFFF" w:sz="0"/>
               <w:right w:val="none" w:color="FFFFFF" w:sz="0"/>
             </w:tcBorders>
-            <w:shd w:fill="E9EFEE" w:color="auto" w:val="clear"/>
+            <w:shd w:fill="F7F5F0" w:color="auto" w:val="clear"/>
             <w:tcMar>
               <w:top w:type="dxa" w:w="90"/>
               <w:left w:type="dxa" w:w="160"/>
@@ -4648,7 +4595,7 @@
                 <w:rFonts w:ascii="Arial" w:cs="Arial" w:eastAsia="Arial" w:hAnsi="Arial"/>
                 <w:b/>
                 <w:bCs/>
-                <w:color w:val="1F4E47"/>
+                <w:color w:val="1B1F24"/>
                 <w:sz w:val="20"/>
                 <w:szCs w:val="20"/>
               </w:rPr>
@@ -4665,7 +4612,7 @@
               <w:bottom w:val="none" w:color="FFFFFF" w:sz="0"/>
               <w:right w:val="none" w:color="FFFFFF" w:sz="0"/>
             </w:tcBorders>
-            <w:shd w:fill="E9EFEE" w:color="auto" w:val="clear"/>
+            <w:shd w:fill="F7F5F0" w:color="auto" w:val="clear"/>
             <w:tcMar>
               <w:top w:type="dxa" w:w="90"/>
               <w:left w:type="dxa" w:w="160"/>
@@ -4679,7 +4626,7 @@
                 <w:rFonts w:ascii="Arial" w:cs="Arial" w:eastAsia="Arial" w:hAnsi="Arial"/>
                 <w:b w:val="false"/>
                 <w:bCs w:val="false"/>
-                <w:color w:val="1F4E47"/>
+                <w:color w:val="1B1F24"/>
                 <w:sz w:val="20"/>
                 <w:szCs w:val="20"/>
               </w:rPr>
@@ -4696,7 +4643,7 @@
               <w:bottom w:val="none" w:color="FFFFFF" w:sz="0"/>
               <w:right w:val="none" w:color="FFFFFF" w:sz="0"/>
             </w:tcBorders>
-            <w:shd w:fill="E9EFEE" w:color="auto" w:val="clear"/>
+            <w:shd w:fill="F7F5F0" w:color="auto" w:val="clear"/>
             <w:tcMar>
               <w:top w:type="dxa" w:w="90"/>
               <w:left w:type="dxa" w:w="160"/>
@@ -4710,7 +4657,7 @@
                 <w:rFonts w:ascii="Arial" w:cs="Arial" w:eastAsia="Arial" w:hAnsi="Arial"/>
                 <w:b w:val="false"/>
                 <w:bCs w:val="false"/>
-                <w:color w:val="1F4E47"/>
+                <w:color w:val="1B1F24"/>
                 <w:sz w:val="20"/>
                 <w:szCs w:val="20"/>
               </w:rPr>
@@ -4743,7 +4690,7 @@
                 <w:rFonts w:ascii="Arial" w:cs="Arial" w:eastAsia="Arial" w:hAnsi="Arial"/>
                 <w:b/>
                 <w:bCs/>
-                <w:color w:val="1F4E47"/>
+                <w:color w:val="1B1F24"/>
                 <w:sz w:val="20"/>
                 <w:szCs w:val="20"/>
               </w:rPr>
@@ -4774,7 +4721,7 @@
                 <w:rFonts w:ascii="Arial" w:cs="Arial" w:eastAsia="Arial" w:hAnsi="Arial"/>
                 <w:b w:val="false"/>
                 <w:bCs w:val="false"/>
-                <w:color w:val="1F4E47"/>
+                <w:color w:val="1B1F24"/>
                 <w:sz w:val="20"/>
                 <w:szCs w:val="20"/>
               </w:rPr>
@@ -4805,7 +4752,7 @@
                 <w:rFonts w:ascii="Arial" w:cs="Arial" w:eastAsia="Arial" w:hAnsi="Arial"/>
                 <w:b w:val="false"/>
                 <w:bCs w:val="false"/>
-                <w:color w:val="1F4E47"/>
+                <w:color w:val="1B1F24"/>
                 <w:sz w:val="20"/>
                 <w:szCs w:val="20"/>
               </w:rPr>
@@ -4824,7 +4771,7 @@
               <w:bottom w:val="none" w:color="FFFFFF" w:sz="0"/>
               <w:right w:val="none" w:color="FFFFFF" w:sz="0"/>
             </w:tcBorders>
-            <w:shd w:fill="E9EFEE" w:color="auto" w:val="clear"/>
+            <w:shd w:fill="F7F5F0" w:color="auto" w:val="clear"/>
             <w:tcMar>
               <w:top w:type="dxa" w:w="90"/>
               <w:left w:type="dxa" w:w="160"/>
@@ -4838,7 +4785,7 @@
                 <w:rFonts w:ascii="Arial" w:cs="Arial" w:eastAsia="Arial" w:hAnsi="Arial"/>
                 <w:b/>
                 <w:bCs/>
-                <w:color w:val="1F4E47"/>
+                <w:color w:val="1B1F24"/>
                 <w:sz w:val="20"/>
                 <w:szCs w:val="20"/>
               </w:rPr>
@@ -4855,7 +4802,7 @@
               <w:bottom w:val="none" w:color="FFFFFF" w:sz="0"/>
               <w:right w:val="none" w:color="FFFFFF" w:sz="0"/>
             </w:tcBorders>
-            <w:shd w:fill="E9EFEE" w:color="auto" w:val="clear"/>
+            <w:shd w:fill="F7F5F0" w:color="auto" w:val="clear"/>
             <w:tcMar>
               <w:top w:type="dxa" w:w="90"/>
               <w:left w:type="dxa" w:w="160"/>
@@ -4869,7 +4816,7 @@
                 <w:rFonts w:ascii="Arial" w:cs="Arial" w:eastAsia="Arial" w:hAnsi="Arial"/>
                 <w:b w:val="false"/>
                 <w:bCs w:val="false"/>
-                <w:color w:val="1F4E47"/>
+                <w:color w:val="1B1F24"/>
                 <w:sz w:val="20"/>
                 <w:szCs w:val="20"/>
               </w:rPr>
@@ -4886,7 +4833,7 @@
               <w:bottom w:val="none" w:color="FFFFFF" w:sz="0"/>
               <w:right w:val="none" w:color="FFFFFF" w:sz="0"/>
             </w:tcBorders>
-            <w:shd w:fill="E9EFEE" w:color="auto" w:val="clear"/>
+            <w:shd w:fill="F7F5F0" w:color="auto" w:val="clear"/>
             <w:tcMar>
               <w:top w:type="dxa" w:w="90"/>
               <w:left w:type="dxa" w:w="160"/>
@@ -4900,7 +4847,7 @@
                 <w:rFonts w:ascii="Arial" w:cs="Arial" w:eastAsia="Arial" w:hAnsi="Arial"/>
                 <w:b w:val="false"/>
                 <w:bCs w:val="false"/>
-                <w:color w:val="1F4E47"/>
+                <w:color w:val="1B1F24"/>
                 <w:sz w:val="20"/>
                 <w:szCs w:val="20"/>
               </w:rPr>
@@ -4933,7 +4880,7 @@
                 <w:rFonts w:ascii="Arial" w:cs="Arial" w:eastAsia="Arial" w:hAnsi="Arial"/>
                 <w:b/>
                 <w:bCs/>
-                <w:color w:val="1F4E47"/>
+                <w:color w:val="1B1F24"/>
                 <w:sz w:val="20"/>
                 <w:szCs w:val="20"/>
               </w:rPr>
@@ -4964,7 +4911,7 @@
                 <w:rFonts w:ascii="Arial" w:cs="Arial" w:eastAsia="Arial" w:hAnsi="Arial"/>
                 <w:b w:val="false"/>
                 <w:bCs w:val="false"/>
-                <w:color w:val="1F4E47"/>
+                <w:color w:val="1B1F24"/>
                 <w:sz w:val="20"/>
                 <w:szCs w:val="20"/>
               </w:rPr>
@@ -4995,7 +4942,7 @@
                 <w:rFonts w:ascii="Arial" w:cs="Arial" w:eastAsia="Arial" w:hAnsi="Arial"/>
                 <w:b w:val="false"/>
                 <w:bCs w:val="false"/>
-                <w:color w:val="1F4E47"/>
+                <w:color w:val="1B1F24"/>
                 <w:sz w:val="20"/>
                 <w:szCs w:val="20"/>
               </w:rPr>
@@ -5020,7 +4967,7 @@
           <w:rFonts w:ascii="Arial" w:cs="Arial" w:eastAsia="Arial" w:hAnsi="Arial"/>
           <w:b/>
           <w:bCs/>
-          <w:color w:val="B07A12"/>
+          <w:color w:val="A67C3D"/>
           <w:sz w:val="20"/>
           <w:szCs w:val="20"/>
         </w:rPr>
@@ -5029,7 +4976,7 @@
       <w:r>
         <w:rPr>
           <w:rFonts w:ascii="Arial" w:cs="Arial" w:eastAsia="Arial" w:hAnsi="Arial"/>
-          <w:color w:val="1F4E47"/>
+          <w:color w:val="1B1F24"/>
           <w:sz w:val="21"/>
           <w:szCs w:val="21"/>
         </w:rPr>
@@ -5093,7 +5040,7 @@
     <w:r>
       <w:rPr>
         <w:rFonts w:ascii="Arial" w:cs="Arial" w:eastAsia="Arial" w:hAnsi="Arial"/>
-        <w:color w:val="1F4E47"/>
+        <w:color w:val="1B1F24"/>
         <w:sz w:val="16"/>
         <w:szCs w:val="16"/>
       </w:rPr>
@@ -5102,7 +5049,7 @@
     <w:r>
       <w:rPr>
         <w:rFonts w:ascii="Arial" w:cs="Arial" w:eastAsia="Arial" w:hAnsi="Arial"/>
-        <w:color w:val="1F4E47"/>
+        <w:color w:val="1B1F24"/>
         <w:sz w:val="16"/>
         <w:szCs w:val="16"/>
       </w:rPr>
@@ -5249,7 +5196,7 @@
         <w:ind w:left="440" w:hanging="280"/>
       </w:pPr>
       <w:rPr>
-        <w:color w:val="F2B134"/>
+        <w:color w:val="A67C3D"/>
       </w:rPr>
     </w:lvl>
   </w:abstractNum>
@@ -5264,7 +5211,7 @@
         <w:ind w:left="480" w:hanging="360"/>
       </w:pPr>
       <w:rPr>
-        <w:color w:val="1F4E47"/>
+        <w:color w:val="1B1F24"/>
         <w:sz w:val="26"/>
         <w:szCs w:val="26"/>
       </w:rPr>
@@ -5283,7 +5230,7 @@
       <w:rPr>
         <w:b/>
         <w:bCs/>
-        <w:color w:val="1F4E47"/>
+        <w:color w:val="1B1F24"/>
       </w:rPr>
     </w:lvl>
   </w:abstractNum>
@@ -5320,7 +5267,7 @@
     <w:rPrDefault>
       <w:rPr>
         <w:rFonts w:ascii="Arial" w:cs="Arial" w:eastAsia="Arial" w:hAnsi="Arial"/>
-        <w:color w:val="1F4E47"/>
+        <w:color w:val="1B1F24"/>
         <w:sz w:val="22"/>
         <w:szCs w:val="22"/>
       </w:rPr>
@@ -5489,12 +5436,10 @@
       <w:outlineLvl w:val="0"/>
     </w:pPr>
     <w:rPr>
-      <w:rFonts w:ascii="Arial" w:cs="Arial" w:eastAsia="Arial" w:hAnsi="Arial"/>
-      <w:b/>
-      <w:bCs/>
-      <w:color w:val="1F4E47"/>
-      <w:sz w:val="44"/>
-      <w:szCs w:val="44"/>
+      <w:rFonts w:ascii="Cambria" w:cs="Cambria" w:eastAsia="Cambria" w:hAnsi="Cambria"/>
+      <w:color w:val="1B1F24"/>
+      <w:sz w:val="48"/>
+      <w:szCs w:val="48"/>
     </w:rPr>
   </w:style>
   <w:style w:type="paragraph" w:styleId="Heading2">
@@ -5506,12 +5451,10 @@
       <w:outlineLvl w:val="1"/>
     </w:pPr>
     <w:rPr>
-      <w:rFonts w:ascii="Arial" w:cs="Arial" w:eastAsia="Arial" w:hAnsi="Arial"/>
-      <w:b/>
-      <w:bCs/>
-      <w:color w:val="1F4E47"/>
-      <w:sz w:val="30"/>
-      <w:szCs w:val="30"/>
+      <w:rFonts w:ascii="Cambria" w:cs="Cambria" w:eastAsia="Cambria" w:hAnsi="Cambria"/>
+      <w:color w:val="1B1F24"/>
+      <w:sz w:val="32"/>
+      <w:szCs w:val="32"/>
     </w:rPr>
   </w:style>
 </w:styles>

</xml_diff>